<commit_message>
changed schedule - open-todos
</commit_message>
<xml_diff>
--- a/schedule/open_todos_06.11.docx
+++ b/schedule/open_todos_06.11.docx
@@ -307,8 +307,14 @@
           <w:ilvl w:val="0"/>
           <w:numId w:val="1"/>
         </w:numPr>
-      </w:pPr>
-      <w:r>
+        <w:rPr>
+          <w:strike/>
+        </w:rPr>
+      </w:pPr>
+      <w:r>
+        <w:rPr>
+          <w:strike/>
+        </w:rPr>
         <w:t>Bennen der verschiedenen Tabs</w:t>
       </w:r>
     </w:p>
@@ -319,24 +325,42 @@
           <w:ilvl w:val="0"/>
           <w:numId w:val="2"/>
         </w:numPr>
-      </w:pPr>
-      <w:r>
+        <w:rPr>
+          <w:strike/>
+        </w:rPr>
+      </w:pPr>
+      <w:r>
+        <w:rPr>
+          <w:strike/>
+        </w:rPr>
         <w:t>Homepage (</w:t>
       </w:r>
       <w:proofErr w:type="spellStart"/>
       <w:r>
+        <w:rPr>
+          <w:strike/>
+        </w:rPr>
         <w:t>about</w:t>
       </w:r>
       <w:proofErr w:type="spellEnd"/>
       <w:r>
-        <w:t xml:space="preserve"> </w:t>
-      </w:r>
-      <w:proofErr w:type="spellStart"/>
-      <w:r>
+        <w:rPr>
+          <w:strike/>
+        </w:rPr>
+        <w:t xml:space="preserve"> </w:t>
+      </w:r>
+      <w:proofErr w:type="spellStart"/>
+      <w:r>
+        <w:rPr>
+          <w:strike/>
+        </w:rPr>
         <w:t>us</w:t>
       </w:r>
       <w:proofErr w:type="spellEnd"/>
       <w:r>
+        <w:rPr>
+          <w:strike/>
+        </w:rPr>
         <w:t xml:space="preserve"> rein)</w:t>
       </w:r>
     </w:p>
@@ -347,24 +371,42 @@
           <w:ilvl w:val="0"/>
           <w:numId w:val="2"/>
         </w:numPr>
-      </w:pPr>
-      <w:r>
+        <w:rPr>
+          <w:strike/>
+        </w:rPr>
+      </w:pPr>
+      <w:r>
+        <w:rPr>
+          <w:strike/>
+        </w:rPr>
         <w:t>Swiss Hospital Data (</w:t>
       </w:r>
       <w:proofErr w:type="spellStart"/>
       <w:r>
+        <w:rPr>
+          <w:strike/>
+        </w:rPr>
         <w:t>about</w:t>
       </w:r>
       <w:proofErr w:type="spellEnd"/>
       <w:r>
-        <w:t xml:space="preserve"> </w:t>
-      </w:r>
-      <w:proofErr w:type="spellStart"/>
-      <w:r>
+        <w:rPr>
+          <w:strike/>
+        </w:rPr>
+        <w:t xml:space="preserve"> </w:t>
+      </w:r>
+      <w:proofErr w:type="spellStart"/>
+      <w:r>
+        <w:rPr>
+          <w:strike/>
+        </w:rPr>
         <w:t>data</w:t>
       </w:r>
       <w:proofErr w:type="spellEnd"/>
       <w:r>
+        <w:rPr>
+          <w:strike/>
+        </w:rPr>
         <w:t xml:space="preserve"> rein)</w:t>
       </w:r>
     </w:p>
@@ -375,8 +417,14 @@
           <w:ilvl w:val="0"/>
           <w:numId w:val="2"/>
         </w:numPr>
-      </w:pPr>
-      <w:r>
+        <w:rPr>
+          <w:strike/>
+        </w:rPr>
+      </w:pPr>
+      <w:r>
+        <w:rPr>
+          <w:strike/>
+        </w:rPr>
         <w:t>Dashboard</w:t>
       </w:r>
     </w:p>
@@ -392,30 +440,54 @@
           <w:ilvl w:val="0"/>
           <w:numId w:val="1"/>
         </w:numPr>
-      </w:pPr>
-      <w:r>
+        <w:rPr>
+          <w:strike/>
+        </w:rPr>
+      </w:pPr>
+      <w:r>
+        <w:rPr>
+          <w:strike/>
+        </w:rPr>
         <w:t xml:space="preserve">Excel </w:t>
       </w:r>
       <w:proofErr w:type="spellStart"/>
       <w:r>
+        <w:rPr>
+          <w:strike/>
+        </w:rPr>
         <w:t>bi_diagramm_data</w:t>
       </w:r>
       <w:proofErr w:type="spellEnd"/>
       <w:r>
+        <w:rPr>
+          <w:strike/>
+        </w:rPr>
         <w:t xml:space="preserve"> anpassen </w:t>
       </w:r>
       <w:r>
+        <w:rPr>
+          <w:strike/>
+        </w:rPr>
         <w:sym w:font="Wingdings" w:char="F0E0"/>
       </w:r>
       <w:r>
+        <w:rPr>
+          <w:strike/>
+        </w:rPr>
         <w:t xml:space="preserve"> so dass </w:t>
       </w:r>
       <w:proofErr w:type="spellStart"/>
       <w:r>
+        <w:rPr>
+          <w:strike/>
+        </w:rPr>
         <w:t>occupancy</w:t>
       </w:r>
       <w:proofErr w:type="spellEnd"/>
       <w:r>
+        <w:rPr>
+          <w:strike/>
+        </w:rPr>
         <w:t xml:space="preserve"> auch mal zu hoch</w:t>
       </w:r>
     </w:p>
@@ -432,6 +504,9 @@
           <w:ilvl w:val="0"/>
           <w:numId w:val="1"/>
         </w:numPr>
+        <w:rPr>
+          <w:strike/>
+        </w:rPr>
       </w:pPr>
       <w:proofErr w:type="spellStart"/>
       <w:r>
@@ -478,10 +553,16 @@
       </w:r>
       <w:proofErr w:type="spellStart"/>
       <w:r>
+        <w:rPr>
+          <w:strike/>
+        </w:rPr>
         <w:t>Regressions</w:t>
       </w:r>
       <w:proofErr w:type="spellEnd"/>
       <w:r>
+        <w:rPr>
+          <w:strike/>
+        </w:rPr>
         <w:t>)</w:t>
       </w:r>
     </w:p>
@@ -493,49 +574,85 @@
           <w:ilvl w:val="0"/>
           <w:numId w:val="1"/>
         </w:numPr>
-      </w:pPr>
-      <w:proofErr w:type="spellStart"/>
-      <w:r>
+        <w:rPr>
+          <w:strike/>
+        </w:rPr>
+      </w:pPr>
+      <w:proofErr w:type="spellStart"/>
+      <w:r>
+        <w:rPr>
+          <w:strike/>
+        </w:rPr>
         <w:t>Develeopment</w:t>
       </w:r>
       <w:proofErr w:type="spellEnd"/>
       <w:r>
-        <w:t xml:space="preserve"> </w:t>
-      </w:r>
-      <w:proofErr w:type="spellStart"/>
-      <w:r>
+        <w:rPr>
+          <w:strike/>
+        </w:rPr>
+        <w:t xml:space="preserve"> </w:t>
+      </w:r>
+      <w:proofErr w:type="spellStart"/>
+      <w:r>
+        <w:rPr>
+          <w:strike/>
+        </w:rPr>
         <w:t>Statistics</w:t>
       </w:r>
       <w:proofErr w:type="spellEnd"/>
       <w:r>
+        <w:rPr>
+          <w:strike/>
+        </w:rPr>
         <w:t xml:space="preserve">: Development </w:t>
       </w:r>
       <w:proofErr w:type="spellStart"/>
       <w:r>
+        <w:rPr>
+          <w:strike/>
+        </w:rPr>
         <w:t>Beds</w:t>
       </w:r>
       <w:proofErr w:type="spellEnd"/>
       <w:r>
+        <w:rPr>
+          <w:strike/>
+        </w:rPr>
         <w:t xml:space="preserve"> vs. </w:t>
       </w:r>
       <w:proofErr w:type="spellStart"/>
       <w:r>
+        <w:rPr>
+          <w:strike/>
+        </w:rPr>
         <w:t>Nurses</w:t>
       </w:r>
       <w:proofErr w:type="spellEnd"/>
       <w:r>
+        <w:rPr>
+          <w:strike/>
+        </w:rPr>
         <w:t xml:space="preserve"> entfernen, aber Entwicklung in Beschreibung bei </w:t>
       </w:r>
       <w:proofErr w:type="spellStart"/>
       <w:r>
+        <w:rPr>
+          <w:strike/>
+        </w:rPr>
         <w:t>Occupancy</w:t>
       </w:r>
       <w:proofErr w:type="spellEnd"/>
       <w:r>
+        <w:rPr>
+          <w:strike/>
+        </w:rPr>
         <w:t xml:space="preserve"> erwähnen &amp; code </w:t>
       </w:r>
       <w:proofErr w:type="spellStart"/>
       <w:r>
+        <w:rPr>
+          <w:strike/>
+        </w:rPr>
         <w:t>drinlassen</w:t>
       </w:r>
       <w:proofErr w:type="spellEnd"/>
@@ -548,16 +665,28 @@
           <w:ilvl w:val="0"/>
           <w:numId w:val="1"/>
         </w:numPr>
-      </w:pPr>
-      <w:r>
+        <w:rPr>
+          <w:strike/>
+        </w:rPr>
+      </w:pPr>
+      <w:r>
+        <w:rPr>
+          <w:strike/>
+        </w:rPr>
         <w:t xml:space="preserve">Filter in </w:t>
       </w:r>
       <w:proofErr w:type="spellStart"/>
       <w:r>
+        <w:rPr>
+          <w:strike/>
+        </w:rPr>
         <w:t>Occupancy</w:t>
       </w:r>
       <w:proofErr w:type="spellEnd"/>
       <w:r>
+        <w:rPr>
+          <w:strike/>
+        </w:rPr>
         <w:t xml:space="preserve"> über obersten Titel</w:t>
       </w:r>
     </w:p>
@@ -645,6 +774,1923 @@
       </w:r>
     </w:p>
     <w:p/>
+    <w:p>
+      <w:proofErr w:type="spellStart"/>
+      <w:r>
+        <w:lastRenderedPageBreak/>
+        <w:t>To</w:t>
+      </w:r>
+      <w:proofErr w:type="spellEnd"/>
+      <w:r>
+        <w:t>-Do 27. &amp; 28. 11.25</w:t>
+      </w:r>
+    </w:p>
+    <w:p/>
+    <w:p>
+      <w:pPr>
+        <w:pStyle w:val="Listenabsatz"/>
+        <w:numPr>
+          <w:ilvl w:val="0"/>
+          <w:numId w:val="5"/>
+        </w:numPr>
+        <w:rPr>
+          <w:color w:val="F2CEED" w:themeColor="accent5" w:themeTint="33"/>
+        </w:rPr>
+      </w:pPr>
+      <w:r>
+        <w:rPr>
+          <w:color w:val="F2CEED" w:themeColor="accent5" w:themeTint="33"/>
+        </w:rPr>
+        <w:t xml:space="preserve">Swiss Hospital Data </w:t>
+      </w:r>
+      <w:r>
+        <w:rPr>
+          <w:color w:val="F2CEED" w:themeColor="accent5" w:themeTint="33"/>
+        </w:rPr>
+        <w:sym w:font="Wingdings" w:char="F0E0"/>
+      </w:r>
+      <w:r>
+        <w:rPr>
+          <w:color w:val="F2CEED" w:themeColor="accent5" w:themeTint="33"/>
+        </w:rPr>
+        <w:t xml:space="preserve"> Linear Regression Tab; Size</w:t>
+      </w:r>
+    </w:p>
+    <w:p>
+      <w:pPr>
+        <w:pStyle w:val="Listenabsatz"/>
+        <w:numPr>
+          <w:ilvl w:val="0"/>
+          <w:numId w:val="5"/>
+        </w:numPr>
+        <w:rPr>
+          <w:color w:val="D86DCB" w:themeColor="accent5" w:themeTint="99"/>
+        </w:rPr>
+      </w:pPr>
+      <w:r>
+        <w:rPr>
+          <w:color w:val="D86DCB" w:themeColor="accent5" w:themeTint="99"/>
+        </w:rPr>
+        <w:t>Neuer Name für «</w:t>
+      </w:r>
+      <w:proofErr w:type="spellStart"/>
+      <w:r>
+        <w:rPr>
+          <w:color w:val="D86DCB" w:themeColor="accent5" w:themeTint="99"/>
+        </w:rPr>
+        <w:t>Beddays</w:t>
+      </w:r>
+      <w:proofErr w:type="spellEnd"/>
+      <w:r>
+        <w:rPr>
+          <w:color w:val="D86DCB" w:themeColor="accent5" w:themeTint="99"/>
+        </w:rPr>
+        <w:t>» &amp; Farbe der Regressionslinie ändern</w:t>
+      </w:r>
+    </w:p>
+    <w:p>
+      <w:pPr>
+        <w:pStyle w:val="Listenabsatz"/>
+        <w:numPr>
+          <w:ilvl w:val="0"/>
+          <w:numId w:val="5"/>
+        </w:numPr>
+        <w:rPr>
+          <w:color w:val="D86DCB" w:themeColor="accent5" w:themeTint="99"/>
+        </w:rPr>
+      </w:pPr>
+      <w:proofErr w:type="spellStart"/>
+      <w:r>
+        <w:rPr>
+          <w:color w:val="D86DCB" w:themeColor="accent5" w:themeTint="99"/>
+        </w:rPr>
+        <w:t>Regressions</w:t>
+      </w:r>
+      <w:proofErr w:type="spellEnd"/>
+      <w:r>
+        <w:rPr>
+          <w:color w:val="D86DCB" w:themeColor="accent5" w:themeTint="99"/>
+        </w:rPr>
+        <w:t xml:space="preserve">: Beschreibung: Nur Korrelation, Zusammenhang, Wie kann </w:t>
+      </w:r>
+      <w:proofErr w:type="spellStart"/>
+      <w:r>
+        <w:rPr>
+          <w:color w:val="D86DCB" w:themeColor="accent5" w:themeTint="99"/>
+        </w:rPr>
+        <w:t>Slope</w:t>
+      </w:r>
+      <w:proofErr w:type="spellEnd"/>
+      <w:r>
+        <w:rPr>
+          <w:color w:val="D86DCB" w:themeColor="accent5" w:themeTint="99"/>
+        </w:rPr>
+        <w:t xml:space="preserve"> interpretiert werden, Wieso? Was wurde gemacht? FE &amp; Ausreisser entfernt teilweise</w:t>
+      </w:r>
+    </w:p>
+    <w:p>
+      <w:pPr>
+        <w:pStyle w:val="Listenabsatz"/>
+        <w:numPr>
+          <w:ilvl w:val="0"/>
+          <w:numId w:val="5"/>
+        </w:numPr>
+        <w:rPr>
+          <w:color w:val="D86DCB" w:themeColor="accent5" w:themeTint="99"/>
+        </w:rPr>
+      </w:pPr>
+      <w:r>
+        <w:rPr>
+          <w:color w:val="D86DCB" w:themeColor="accent5" w:themeTint="99"/>
+        </w:rPr>
+        <w:t xml:space="preserve">Beim Datensatz noch </w:t>
+      </w:r>
+      <w:proofErr w:type="spellStart"/>
+      <w:r>
+        <w:rPr>
+          <w:color w:val="D86DCB" w:themeColor="accent5" w:themeTint="99"/>
+        </w:rPr>
+        <w:t>none</w:t>
+      </w:r>
+      <w:proofErr w:type="spellEnd"/>
+      <w:r>
+        <w:rPr>
+          <w:color w:val="D86DCB" w:themeColor="accent5" w:themeTint="99"/>
+        </w:rPr>
+        <w:t xml:space="preserve"> durch X ersetzen?</w:t>
+      </w:r>
+    </w:p>
+    <w:p>
+      <w:pPr>
+        <w:pStyle w:val="Listenabsatz"/>
+        <w:numPr>
+          <w:ilvl w:val="0"/>
+          <w:numId w:val="5"/>
+        </w:numPr>
+        <w:rPr>
+          <w:color w:val="D86DCB" w:themeColor="accent5" w:themeTint="99"/>
+        </w:rPr>
+      </w:pPr>
+      <w:r>
+        <w:rPr>
+          <w:color w:val="D86DCB" w:themeColor="accent5" w:themeTint="99"/>
+        </w:rPr>
+        <w:t>Zeichnung und Bild rein</w:t>
+      </w:r>
+    </w:p>
+    <w:p>
+      <w:pPr>
+        <w:pStyle w:val="Listenabsatz"/>
+        <w:numPr>
+          <w:ilvl w:val="0"/>
+          <w:numId w:val="5"/>
+        </w:numPr>
+        <w:rPr>
+          <w:color w:val="D86DCB" w:themeColor="accent5" w:themeTint="99"/>
+        </w:rPr>
+      </w:pPr>
+      <w:r>
+        <w:rPr>
+          <w:color w:val="D86DCB" w:themeColor="accent5" w:themeTint="99"/>
+        </w:rPr>
+        <w:t>Konfidenzintervall bei Regressionen</w:t>
+      </w:r>
+    </w:p>
+    <w:p>
+      <w:pPr>
+        <w:pStyle w:val="Listenabsatz"/>
+        <w:numPr>
+          <w:ilvl w:val="0"/>
+          <w:numId w:val="5"/>
+        </w:numPr>
+        <w:rPr>
+          <w:color w:val="D86DCB" w:themeColor="accent5" w:themeTint="99"/>
+        </w:rPr>
+      </w:pPr>
+      <w:r>
+        <w:rPr>
+          <w:color w:val="D86DCB" w:themeColor="accent5" w:themeTint="99"/>
+        </w:rPr>
+        <w:t xml:space="preserve">Einfärben von Region-Datenpunkte </w:t>
+      </w:r>
+      <w:r>
+        <w:rPr>
+          <w:color w:val="D86DCB" w:themeColor="accent5" w:themeTint="99"/>
+        </w:rPr>
+        <w:sym w:font="Wingdings" w:char="F0E0"/>
+      </w:r>
+      <w:r>
+        <w:rPr>
+          <w:color w:val="D86DCB" w:themeColor="accent5" w:themeTint="99"/>
+        </w:rPr>
+        <w:t xml:space="preserve"> Regression</w:t>
+      </w:r>
+    </w:p>
+    <w:p>
+      <w:pPr>
+        <w:pStyle w:val="Listenabsatz"/>
+        <w:numPr>
+          <w:ilvl w:val="0"/>
+          <w:numId w:val="5"/>
+        </w:numPr>
+        <w:rPr>
+          <w:color w:val="F2CEED" w:themeColor="accent5" w:themeTint="33"/>
+        </w:rPr>
+      </w:pPr>
+      <w:r>
+        <w:rPr>
+          <w:color w:val="F2CEED" w:themeColor="accent5" w:themeTint="33"/>
+        </w:rPr>
+        <w:t xml:space="preserve">Regional </w:t>
+      </w:r>
+      <w:proofErr w:type="spellStart"/>
+      <w:r>
+        <w:rPr>
+          <w:color w:val="F2CEED" w:themeColor="accent5" w:themeTint="33"/>
+        </w:rPr>
+        <w:t>Structure</w:t>
+      </w:r>
+      <w:proofErr w:type="spellEnd"/>
+      <w:r>
+        <w:rPr>
+          <w:color w:val="F2CEED" w:themeColor="accent5" w:themeTint="33"/>
+        </w:rPr>
+        <w:t xml:space="preserve"> Trend</w:t>
+      </w:r>
+    </w:p>
+    <w:p>
+      <w:pPr>
+        <w:pStyle w:val="Listenabsatz"/>
+        <w:numPr>
+          <w:ilvl w:val="0"/>
+          <w:numId w:val="5"/>
+        </w:numPr>
+      </w:pPr>
+      <w:r>
+        <w:rPr>
+          <w:color w:val="0F9ED5" w:themeColor="accent4"/>
+        </w:rPr>
+        <w:t xml:space="preserve">Home: 4-5 </w:t>
+      </w:r>
+      <w:proofErr w:type="spellStart"/>
+      <w:r>
+        <w:rPr>
+          <w:color w:val="0F9ED5" w:themeColor="accent4"/>
+        </w:rPr>
+        <w:t>business</w:t>
+      </w:r>
+      <w:proofErr w:type="spellEnd"/>
+      <w:r>
+        <w:rPr>
+          <w:color w:val="0F9ED5" w:themeColor="accent4"/>
+        </w:rPr>
+        <w:t xml:space="preserve"> </w:t>
+      </w:r>
+      <w:proofErr w:type="spellStart"/>
+      <w:r>
+        <w:rPr>
+          <w:color w:val="0F9ED5" w:themeColor="accent4"/>
+        </w:rPr>
+        <w:t>questions</w:t>
+      </w:r>
+      <w:proofErr w:type="spellEnd"/>
+    </w:p>
+    <w:p>
+      <w:pPr>
+        <w:pStyle w:val="Listenabsatz"/>
+        <w:numPr>
+          <w:ilvl w:val="0"/>
+          <w:numId w:val="5"/>
+        </w:numPr>
+        <w:rPr>
+          <w:color w:val="0F9ED5" w:themeColor="accent4"/>
+        </w:rPr>
+      </w:pPr>
+      <w:r>
+        <w:rPr>
+          <w:color w:val="0F9ED5" w:themeColor="accent4"/>
+        </w:rPr>
+        <w:t xml:space="preserve">Summary </w:t>
+      </w:r>
+      <w:proofErr w:type="spellStart"/>
+      <w:r>
+        <w:rPr>
+          <w:color w:val="0F9ED5" w:themeColor="accent4"/>
+        </w:rPr>
+        <w:t>of</w:t>
+      </w:r>
+      <w:proofErr w:type="spellEnd"/>
+      <w:r>
+        <w:rPr>
+          <w:color w:val="0F9ED5" w:themeColor="accent4"/>
+        </w:rPr>
+        <w:t xml:space="preserve"> </w:t>
+      </w:r>
+      <w:proofErr w:type="spellStart"/>
+      <w:r>
+        <w:rPr>
+          <w:color w:val="0F9ED5" w:themeColor="accent4"/>
+        </w:rPr>
+        <w:t>key</w:t>
+      </w:r>
+      <w:proofErr w:type="spellEnd"/>
+      <w:r>
+        <w:rPr>
+          <w:color w:val="0F9ED5" w:themeColor="accent4"/>
+        </w:rPr>
+        <w:t xml:space="preserve"> </w:t>
+      </w:r>
+      <w:proofErr w:type="spellStart"/>
+      <w:r>
+        <w:rPr>
+          <w:color w:val="0F9ED5" w:themeColor="accent4"/>
+        </w:rPr>
+        <w:t>visuals</w:t>
+      </w:r>
+      <w:proofErr w:type="spellEnd"/>
+      <w:r>
+        <w:rPr>
+          <w:color w:val="0F9ED5" w:themeColor="accent4"/>
+        </w:rPr>
+        <w:t xml:space="preserve"> and </w:t>
+      </w:r>
+      <w:proofErr w:type="spellStart"/>
+      <w:r>
+        <w:rPr>
+          <w:color w:val="0F9ED5" w:themeColor="accent4"/>
+        </w:rPr>
+        <w:t>take</w:t>
+      </w:r>
+      <w:proofErr w:type="spellEnd"/>
+      <w:r>
+        <w:rPr>
+          <w:color w:val="0F9ED5" w:themeColor="accent4"/>
+        </w:rPr>
+        <w:t xml:space="preserve"> </w:t>
+      </w:r>
+      <w:proofErr w:type="spellStart"/>
+      <w:r>
+        <w:rPr>
+          <w:color w:val="0F9ED5" w:themeColor="accent4"/>
+        </w:rPr>
+        <w:t>home</w:t>
+      </w:r>
+      <w:proofErr w:type="spellEnd"/>
+      <w:r>
+        <w:rPr>
+          <w:color w:val="0F9ED5" w:themeColor="accent4"/>
+        </w:rPr>
+        <w:t xml:space="preserve"> </w:t>
+      </w:r>
+      <w:proofErr w:type="spellStart"/>
+      <w:r>
+        <w:rPr>
+          <w:color w:val="0F9ED5" w:themeColor="accent4"/>
+        </w:rPr>
+        <w:t>messages</w:t>
+      </w:r>
+      <w:proofErr w:type="spellEnd"/>
+    </w:p>
+    <w:p>
+      <w:pPr>
+        <w:pStyle w:val="Listenabsatz"/>
+        <w:numPr>
+          <w:ilvl w:val="0"/>
+          <w:numId w:val="5"/>
+        </w:numPr>
+        <w:rPr>
+          <w:color w:val="0F9ED5" w:themeColor="accent4"/>
+        </w:rPr>
+      </w:pPr>
+      <w:r>
+        <w:rPr>
+          <w:color w:val="0F9ED5" w:themeColor="accent4"/>
+        </w:rPr>
+        <w:t xml:space="preserve">More explicit </w:t>
+      </w:r>
+      <w:proofErr w:type="spellStart"/>
+      <w:r>
+        <w:rPr>
+          <w:color w:val="0F9ED5" w:themeColor="accent4"/>
+        </w:rPr>
+        <w:t>description</w:t>
+      </w:r>
+      <w:proofErr w:type="spellEnd"/>
+      <w:r>
+        <w:rPr>
+          <w:color w:val="0F9ED5" w:themeColor="accent4"/>
+        </w:rPr>
+        <w:t xml:space="preserve"> on </w:t>
+      </w:r>
+      <w:proofErr w:type="spellStart"/>
+      <w:r>
+        <w:rPr>
+          <w:color w:val="0F9ED5" w:themeColor="accent4"/>
+        </w:rPr>
+        <w:t>our</w:t>
+      </w:r>
+      <w:proofErr w:type="spellEnd"/>
+      <w:r>
+        <w:rPr>
+          <w:color w:val="0F9ED5" w:themeColor="accent4"/>
+        </w:rPr>
+        <w:t xml:space="preserve"> </w:t>
+      </w:r>
+      <w:proofErr w:type="spellStart"/>
+      <w:r>
+        <w:rPr>
+          <w:color w:val="0F9ED5" w:themeColor="accent4"/>
+        </w:rPr>
+        <w:t>starting</w:t>
+      </w:r>
+      <w:proofErr w:type="spellEnd"/>
+      <w:r>
+        <w:rPr>
+          <w:color w:val="0F9ED5" w:themeColor="accent4"/>
+        </w:rPr>
+        <w:t xml:space="preserve"> </w:t>
+      </w:r>
+      <w:proofErr w:type="spellStart"/>
+      <w:r>
+        <w:rPr>
+          <w:color w:val="0F9ED5" w:themeColor="accent4"/>
+        </w:rPr>
+        <w:t>page</w:t>
+      </w:r>
+      <w:proofErr w:type="spellEnd"/>
+      <w:r>
+        <w:rPr>
+          <w:color w:val="0F9ED5" w:themeColor="accent4"/>
+        </w:rPr>
+        <w:t xml:space="preserve"> </w:t>
+      </w:r>
+      <w:r>
+        <w:rPr>
+          <w:color w:val="0F9ED5" w:themeColor="accent4"/>
+        </w:rPr>
+        <w:sym w:font="Wingdings" w:char="F0E0"/>
+      </w:r>
+      <w:r>
+        <w:rPr>
+          <w:color w:val="0F9ED5" w:themeColor="accent4"/>
+        </w:rPr>
+        <w:t xml:space="preserve"> «</w:t>
+      </w:r>
+      <w:proofErr w:type="spellStart"/>
+      <w:r>
+        <w:rPr>
+          <w:color w:val="0F9ED5" w:themeColor="accent4"/>
+        </w:rPr>
+        <w:t>s’chind</w:t>
+      </w:r>
+      <w:proofErr w:type="spellEnd"/>
+      <w:r>
+        <w:rPr>
+          <w:color w:val="0F9ED5" w:themeColor="accent4"/>
+        </w:rPr>
+        <w:t xml:space="preserve"> bim </w:t>
+      </w:r>
+      <w:proofErr w:type="spellStart"/>
+      <w:r>
+        <w:rPr>
+          <w:color w:val="0F9ED5" w:themeColor="accent4"/>
+        </w:rPr>
+        <w:t>name</w:t>
+      </w:r>
+      <w:proofErr w:type="spellEnd"/>
+      <w:r>
+        <w:rPr>
+          <w:color w:val="0F9ED5" w:themeColor="accent4"/>
+        </w:rPr>
+        <w:t xml:space="preserve"> nenne»</w:t>
+      </w:r>
+    </w:p>
+    <w:p>
+      <w:pPr>
+        <w:pStyle w:val="Listenabsatz"/>
+        <w:numPr>
+          <w:ilvl w:val="0"/>
+          <w:numId w:val="5"/>
+        </w:numPr>
+        <w:rPr>
+          <w:color w:val="00B0F0"/>
+        </w:rPr>
+      </w:pPr>
+      <w:r>
+        <w:rPr>
+          <w:color w:val="00B0F0"/>
+        </w:rPr>
+        <w:t xml:space="preserve">Content </w:t>
+      </w:r>
+      <w:proofErr w:type="spellStart"/>
+      <w:r>
+        <w:rPr>
+          <w:color w:val="00B0F0"/>
+        </w:rPr>
+        <w:t>structured</w:t>
+      </w:r>
+      <w:proofErr w:type="spellEnd"/>
+      <w:r>
+        <w:rPr>
+          <w:color w:val="00B0F0"/>
+        </w:rPr>
+        <w:t xml:space="preserve"> </w:t>
+      </w:r>
+      <w:proofErr w:type="spellStart"/>
+      <w:r>
+        <w:rPr>
+          <w:color w:val="00B0F0"/>
+        </w:rPr>
+        <w:t>as</w:t>
+      </w:r>
+      <w:proofErr w:type="spellEnd"/>
+      <w:r>
+        <w:rPr>
+          <w:color w:val="00B0F0"/>
+        </w:rPr>
+        <w:t xml:space="preserve"> a </w:t>
+      </w:r>
+      <w:proofErr w:type="spellStart"/>
+      <w:r>
+        <w:rPr>
+          <w:color w:val="00B0F0"/>
+        </w:rPr>
+        <w:t>question</w:t>
+      </w:r>
+      <w:proofErr w:type="spellEnd"/>
+      <w:r>
+        <w:rPr>
+          <w:color w:val="00B0F0"/>
+        </w:rPr>
+        <w:t xml:space="preserve"> </w:t>
+      </w:r>
+      <w:proofErr w:type="spellStart"/>
+      <w:r>
+        <w:rPr>
+          <w:color w:val="00B0F0"/>
+        </w:rPr>
+        <w:t>format</w:t>
+      </w:r>
+      <w:proofErr w:type="spellEnd"/>
+      <w:r>
+        <w:rPr>
+          <w:color w:val="00B0F0"/>
+        </w:rPr>
+        <w:t xml:space="preserve"> </w:t>
+      </w:r>
+      <w:r>
+        <w:rPr>
+          <w:color w:val="00B0F0"/>
+        </w:rPr>
+        <w:sym w:font="Wingdings" w:char="F0E0"/>
+      </w:r>
+      <w:r>
+        <w:rPr>
+          <w:color w:val="00B0F0"/>
+        </w:rPr>
+        <w:t xml:space="preserve"> </w:t>
+      </w:r>
+      <w:proofErr w:type="spellStart"/>
+      <w:r>
+        <w:rPr>
+          <w:color w:val="00B0F0"/>
+        </w:rPr>
+        <w:t>overview</w:t>
+      </w:r>
+      <w:proofErr w:type="spellEnd"/>
+      <w:r>
+        <w:rPr>
+          <w:color w:val="00B0F0"/>
+        </w:rPr>
+        <w:t xml:space="preserve"> </w:t>
+      </w:r>
+      <w:proofErr w:type="spellStart"/>
+      <w:r>
+        <w:rPr>
+          <w:color w:val="00B0F0"/>
+        </w:rPr>
+        <w:t>description</w:t>
+      </w:r>
+      <w:proofErr w:type="spellEnd"/>
+      <w:r>
+        <w:rPr>
+          <w:color w:val="00B0F0"/>
+        </w:rPr>
+        <w:t xml:space="preserve"> </w:t>
+      </w:r>
+      <w:proofErr w:type="spellStart"/>
+      <w:r>
+        <w:rPr>
+          <w:color w:val="00B0F0"/>
+        </w:rPr>
+        <w:t>with</w:t>
+      </w:r>
+      <w:proofErr w:type="spellEnd"/>
+      <w:r>
+        <w:rPr>
+          <w:color w:val="00B0F0"/>
+        </w:rPr>
+        <w:t xml:space="preserve"> </w:t>
+      </w:r>
+      <w:proofErr w:type="spellStart"/>
+      <w:r>
+        <w:rPr>
+          <w:color w:val="00B0F0"/>
+        </w:rPr>
+        <w:t>questions</w:t>
+      </w:r>
+      <w:proofErr w:type="spellEnd"/>
+    </w:p>
+    <w:p>
+      <w:pPr>
+        <w:pStyle w:val="Listenabsatz"/>
+        <w:numPr>
+          <w:ilvl w:val="0"/>
+          <w:numId w:val="5"/>
+        </w:numPr>
+        <w:rPr>
+          <w:color w:val="F2CEED" w:themeColor="accent5" w:themeTint="33"/>
+        </w:rPr>
+      </w:pPr>
+      <w:r>
+        <w:rPr>
+          <w:color w:val="F2CEED" w:themeColor="accent5" w:themeTint="33"/>
+        </w:rPr>
+        <w:t xml:space="preserve">«Dashboard» und «Swiss Hospital Data» </w:t>
+      </w:r>
+      <w:proofErr w:type="spellStart"/>
+      <w:r>
+        <w:rPr>
+          <w:color w:val="F2CEED" w:themeColor="accent5" w:themeTint="33"/>
+        </w:rPr>
+        <w:t>umbennenen</w:t>
+      </w:r>
+      <w:proofErr w:type="spellEnd"/>
+    </w:p>
+    <w:p>
+      <w:pPr>
+        <w:pStyle w:val="Listenabsatz"/>
+        <w:numPr>
+          <w:ilvl w:val="0"/>
+          <w:numId w:val="5"/>
+        </w:numPr>
+        <w:rPr>
+          <w:color w:val="F2CEED" w:themeColor="accent5" w:themeTint="33"/>
+        </w:rPr>
+      </w:pPr>
+      <w:r>
+        <w:rPr>
+          <w:color w:val="F2CEED" w:themeColor="accent5" w:themeTint="33"/>
+        </w:rPr>
+        <w:t xml:space="preserve">Farbe bei Gauge </w:t>
+      </w:r>
+      <w:proofErr w:type="spellStart"/>
+      <w:r>
+        <w:rPr>
+          <w:color w:val="F2CEED" w:themeColor="accent5" w:themeTint="33"/>
+        </w:rPr>
+        <w:t>Function</w:t>
+      </w:r>
+      <w:proofErr w:type="spellEnd"/>
+      <w:r>
+        <w:rPr>
+          <w:color w:val="F2CEED" w:themeColor="accent5" w:themeTint="33"/>
+        </w:rPr>
+        <w:t xml:space="preserve"> in Dashboard </w:t>
+      </w:r>
+      <w:r>
+        <w:rPr>
+          <w:color w:val="F2CEED" w:themeColor="accent5" w:themeTint="33"/>
+        </w:rPr>
+        <w:sym w:font="Wingdings" w:char="F0E0"/>
+      </w:r>
+      <w:r>
+        <w:rPr>
+          <w:color w:val="F2CEED" w:themeColor="accent5" w:themeTint="33"/>
+        </w:rPr>
+        <w:t xml:space="preserve"> </w:t>
+      </w:r>
+      <w:proofErr w:type="spellStart"/>
+      <w:r>
+        <w:rPr>
+          <w:color w:val="F2CEED" w:themeColor="accent5" w:themeTint="33"/>
+        </w:rPr>
+        <w:t>red</w:t>
+      </w:r>
+      <w:proofErr w:type="spellEnd"/>
+      <w:r>
+        <w:rPr>
+          <w:color w:val="F2CEED" w:themeColor="accent5" w:themeTint="33"/>
+        </w:rPr>
+        <w:t>!</w:t>
+      </w:r>
+    </w:p>
+    <w:p>
+      <w:pPr>
+        <w:pStyle w:val="Listenabsatz"/>
+        <w:numPr>
+          <w:ilvl w:val="0"/>
+          <w:numId w:val="5"/>
+        </w:numPr>
+        <w:rPr>
+          <w:color w:val="F2CEED" w:themeColor="accent5" w:themeTint="33"/>
+        </w:rPr>
+      </w:pPr>
+      <w:proofErr w:type="spellStart"/>
+      <w:r>
+        <w:rPr>
+          <w:color w:val="F2CEED" w:themeColor="accent5" w:themeTint="33"/>
+        </w:rPr>
+        <w:t>Dasboard</w:t>
+      </w:r>
+      <w:proofErr w:type="spellEnd"/>
+      <w:r>
+        <w:rPr>
+          <w:color w:val="F2CEED" w:themeColor="accent5" w:themeTint="33"/>
+        </w:rPr>
+        <w:t xml:space="preserve"> </w:t>
+      </w:r>
+      <w:r>
+        <w:rPr>
+          <w:color w:val="F2CEED" w:themeColor="accent5" w:themeTint="33"/>
+        </w:rPr>
+        <w:sym w:font="Wingdings" w:char="F0E0"/>
+      </w:r>
+      <w:r>
+        <w:rPr>
+          <w:color w:val="F2CEED" w:themeColor="accent5" w:themeTint="33"/>
+        </w:rPr>
+        <w:t xml:space="preserve"> </w:t>
+      </w:r>
+      <w:proofErr w:type="spellStart"/>
+      <w:r>
+        <w:rPr>
+          <w:color w:val="F2CEED" w:themeColor="accent5" w:themeTint="33"/>
+        </w:rPr>
+        <w:t>Percentage</w:t>
+      </w:r>
+      <w:proofErr w:type="spellEnd"/>
+      <w:r>
+        <w:rPr>
+          <w:color w:val="F2CEED" w:themeColor="accent5" w:themeTint="33"/>
+        </w:rPr>
+        <w:t xml:space="preserve"> </w:t>
+      </w:r>
+      <w:proofErr w:type="spellStart"/>
+      <w:r>
+        <w:rPr>
+          <w:color w:val="F2CEED" w:themeColor="accent5" w:themeTint="33"/>
+        </w:rPr>
+        <w:t>change</w:t>
+      </w:r>
+      <w:proofErr w:type="spellEnd"/>
+      <w:r>
+        <w:rPr>
+          <w:color w:val="F2CEED" w:themeColor="accent5" w:themeTint="33"/>
+        </w:rPr>
+        <w:t xml:space="preserve"> </w:t>
+      </w:r>
+      <w:proofErr w:type="spellStart"/>
+      <w:r>
+        <w:rPr>
+          <w:color w:val="F2CEED" w:themeColor="accent5" w:themeTint="33"/>
+        </w:rPr>
+        <w:t>descriptioin</w:t>
+      </w:r>
+      <w:proofErr w:type="spellEnd"/>
+      <w:r>
+        <w:rPr>
+          <w:color w:val="F2CEED" w:themeColor="accent5" w:themeTint="33"/>
+        </w:rPr>
+        <w:t xml:space="preserve"> </w:t>
+      </w:r>
+      <w:proofErr w:type="spellStart"/>
+      <w:r>
+        <w:rPr>
+          <w:color w:val="F2CEED" w:themeColor="accent5" w:themeTint="33"/>
+        </w:rPr>
+        <w:t>with</w:t>
+      </w:r>
+      <w:proofErr w:type="spellEnd"/>
+      <w:r>
+        <w:rPr>
+          <w:color w:val="F2CEED" w:themeColor="accent5" w:themeTint="33"/>
+        </w:rPr>
+        <w:t xml:space="preserve"> a </w:t>
+      </w:r>
+      <w:proofErr w:type="spellStart"/>
+      <w:r>
+        <w:rPr>
+          <w:color w:val="F2CEED" w:themeColor="accent5" w:themeTint="33"/>
+        </w:rPr>
+        <w:t>hover</w:t>
+      </w:r>
+      <w:proofErr w:type="spellEnd"/>
+      <w:r>
+        <w:rPr>
+          <w:color w:val="F2CEED" w:themeColor="accent5" w:themeTint="33"/>
+        </w:rPr>
+        <w:t xml:space="preserve"> </w:t>
+      </w:r>
+      <w:proofErr w:type="spellStart"/>
+      <w:r>
+        <w:rPr>
+          <w:color w:val="F2CEED" w:themeColor="accent5" w:themeTint="33"/>
+        </w:rPr>
+        <w:t>note</w:t>
+      </w:r>
+      <w:proofErr w:type="spellEnd"/>
+    </w:p>
+    <w:p>
+      <w:pPr>
+        <w:pStyle w:val="Listenabsatz"/>
+        <w:numPr>
+          <w:ilvl w:val="0"/>
+          <w:numId w:val="5"/>
+        </w:numPr>
+        <w:rPr>
+          <w:color w:val="F2CEED" w:themeColor="accent5" w:themeTint="33"/>
+        </w:rPr>
+      </w:pPr>
+      <w:proofErr w:type="spellStart"/>
+      <w:r>
+        <w:rPr>
+          <w:color w:val="F2CEED" w:themeColor="accent5" w:themeTint="33"/>
+        </w:rPr>
+        <w:t>Dasboard</w:t>
+      </w:r>
+      <w:proofErr w:type="spellEnd"/>
+      <w:r>
+        <w:rPr>
+          <w:color w:val="F2CEED" w:themeColor="accent5" w:themeTint="33"/>
+        </w:rPr>
+        <w:t xml:space="preserve"> </w:t>
+      </w:r>
+      <w:r>
+        <w:rPr>
+          <w:color w:val="F2CEED" w:themeColor="accent5" w:themeTint="33"/>
+        </w:rPr>
+        <w:sym w:font="Wingdings" w:char="F0E0"/>
+      </w:r>
+      <w:r>
+        <w:rPr>
+          <w:color w:val="F2CEED" w:themeColor="accent5" w:themeTint="33"/>
+        </w:rPr>
+        <w:t xml:space="preserve"> Line Chart </w:t>
+      </w:r>
+      <w:proofErr w:type="spellStart"/>
+      <w:r>
+        <w:rPr>
+          <w:color w:val="F2CEED" w:themeColor="accent5" w:themeTint="33"/>
+        </w:rPr>
+        <w:t>for</w:t>
+      </w:r>
+      <w:proofErr w:type="spellEnd"/>
+      <w:r>
+        <w:rPr>
+          <w:color w:val="F2CEED" w:themeColor="accent5" w:themeTint="33"/>
+        </w:rPr>
+        <w:t xml:space="preserve"> Average </w:t>
+      </w:r>
+      <w:proofErr w:type="spellStart"/>
+      <w:r>
+        <w:rPr>
+          <w:color w:val="F2CEED" w:themeColor="accent5" w:themeTint="33"/>
+        </w:rPr>
+        <w:t>Cost</w:t>
+      </w:r>
+      <w:proofErr w:type="spellEnd"/>
+    </w:p>
+    <w:p>
+      <w:pPr>
+        <w:pStyle w:val="Listenabsatz"/>
+        <w:numPr>
+          <w:ilvl w:val="0"/>
+          <w:numId w:val="5"/>
+        </w:numPr>
+        <w:rPr>
+          <w:color w:val="F2CEED" w:themeColor="accent5" w:themeTint="33"/>
+        </w:rPr>
+      </w:pPr>
+      <w:r>
+        <w:rPr>
+          <w:color w:val="F2CEED" w:themeColor="accent5" w:themeTint="33"/>
+        </w:rPr>
+        <w:t xml:space="preserve">Dashboard </w:t>
+      </w:r>
+      <w:r>
+        <w:rPr>
+          <w:color w:val="F2CEED" w:themeColor="accent5" w:themeTint="33"/>
+        </w:rPr>
+        <w:sym w:font="Wingdings" w:char="F0E0"/>
+      </w:r>
+      <w:r>
+        <w:rPr>
+          <w:color w:val="F2CEED" w:themeColor="accent5" w:themeTint="33"/>
+        </w:rPr>
+        <w:t xml:space="preserve"> </w:t>
+      </w:r>
+      <w:proofErr w:type="spellStart"/>
+      <w:r>
+        <w:rPr>
+          <w:color w:val="F2CEED" w:themeColor="accent5" w:themeTint="33"/>
+        </w:rPr>
+        <w:t>Bed</w:t>
+      </w:r>
+      <w:proofErr w:type="spellEnd"/>
+      <w:r>
+        <w:rPr>
+          <w:color w:val="F2CEED" w:themeColor="accent5" w:themeTint="33"/>
+        </w:rPr>
+        <w:t xml:space="preserve"> </w:t>
+      </w:r>
+      <w:proofErr w:type="spellStart"/>
+      <w:r>
+        <w:rPr>
+          <w:color w:val="F2CEED" w:themeColor="accent5" w:themeTint="33"/>
+        </w:rPr>
+        <w:t>Occupancy</w:t>
+      </w:r>
+      <w:proofErr w:type="spellEnd"/>
+      <w:r>
+        <w:rPr>
+          <w:color w:val="F2CEED" w:themeColor="accent5" w:themeTint="33"/>
+        </w:rPr>
+        <w:t>: Area Plot</w:t>
+      </w:r>
+    </w:p>
+    <w:p>
+      <w:pPr>
+        <w:pStyle w:val="Listenabsatz"/>
+        <w:numPr>
+          <w:ilvl w:val="0"/>
+          <w:numId w:val="5"/>
+        </w:numPr>
+        <w:rPr>
+          <w:color w:val="F2CEED" w:themeColor="accent5" w:themeTint="33"/>
+        </w:rPr>
+      </w:pPr>
+      <w:proofErr w:type="spellStart"/>
+      <w:r>
+        <w:rPr>
+          <w:color w:val="F2CEED" w:themeColor="accent5" w:themeTint="33"/>
+        </w:rPr>
+        <w:t>Dasboard</w:t>
+      </w:r>
+      <w:proofErr w:type="spellEnd"/>
+      <w:r>
+        <w:rPr>
+          <w:color w:val="F2CEED" w:themeColor="accent5" w:themeTint="33"/>
+        </w:rPr>
+        <w:t xml:space="preserve"> </w:t>
+      </w:r>
+      <w:r>
+        <w:rPr>
+          <w:color w:val="F2CEED" w:themeColor="accent5" w:themeTint="33"/>
+        </w:rPr>
+        <w:sym w:font="Wingdings" w:char="F0E0"/>
+      </w:r>
+      <w:r>
+        <w:rPr>
+          <w:color w:val="F2CEED" w:themeColor="accent5" w:themeTint="33"/>
+        </w:rPr>
+        <w:t xml:space="preserve"> Area Plots 2x2</w:t>
+      </w:r>
+    </w:p>
+    <w:p>
+      <w:pPr>
+        <w:pStyle w:val="Listenabsatz"/>
+        <w:numPr>
+          <w:ilvl w:val="0"/>
+          <w:numId w:val="5"/>
+        </w:numPr>
+        <w:rPr>
+          <w:color w:val="F2CEED" w:themeColor="accent5" w:themeTint="33"/>
+        </w:rPr>
+      </w:pPr>
+      <w:proofErr w:type="spellStart"/>
+      <w:r>
+        <w:rPr>
+          <w:color w:val="F2CEED" w:themeColor="accent5" w:themeTint="33"/>
+        </w:rPr>
+        <w:t>Smaller</w:t>
+      </w:r>
+      <w:proofErr w:type="spellEnd"/>
+      <w:r>
+        <w:rPr>
+          <w:color w:val="F2CEED" w:themeColor="accent5" w:themeTint="33"/>
+        </w:rPr>
+        <w:t xml:space="preserve"> Picture</w:t>
+      </w:r>
+    </w:p>
+    <w:p/>
+    <w:p>
+      <w:proofErr w:type="spellStart"/>
+      <w:r>
+        <w:t>Presentation</w:t>
+      </w:r>
+      <w:proofErr w:type="spellEnd"/>
+    </w:p>
+    <w:p>
+      <w:pPr>
+        <w:pStyle w:val="Listenabsatz"/>
+        <w:numPr>
+          <w:ilvl w:val="0"/>
+          <w:numId w:val="5"/>
+        </w:numPr>
+      </w:pPr>
+      <w:r>
+        <w:t xml:space="preserve">Write down </w:t>
+      </w:r>
+      <w:proofErr w:type="spellStart"/>
+      <w:r>
+        <w:t>key</w:t>
+      </w:r>
+      <w:proofErr w:type="spellEnd"/>
+      <w:r>
+        <w:t xml:space="preserve"> </w:t>
+      </w:r>
+      <w:proofErr w:type="spellStart"/>
+      <w:r>
+        <w:t>questions</w:t>
+      </w:r>
+      <w:proofErr w:type="spellEnd"/>
+      <w:r>
+        <w:t xml:space="preserve"> and </w:t>
+      </w:r>
+      <w:proofErr w:type="spellStart"/>
+      <w:r>
+        <w:t>focus</w:t>
+      </w:r>
+      <w:proofErr w:type="spellEnd"/>
+      <w:r>
+        <w:t xml:space="preserve"> on </w:t>
+      </w:r>
+      <w:proofErr w:type="spellStart"/>
+      <w:r>
+        <w:t>most</w:t>
+      </w:r>
+      <w:proofErr w:type="spellEnd"/>
+      <w:r>
+        <w:t xml:space="preserve"> </w:t>
+      </w:r>
+      <w:proofErr w:type="spellStart"/>
+      <w:r>
+        <w:t>important</w:t>
+      </w:r>
+      <w:proofErr w:type="spellEnd"/>
+      <w:r>
+        <w:t>/</w:t>
+      </w:r>
+      <w:proofErr w:type="spellStart"/>
+      <w:r>
+        <w:t>interesting</w:t>
+      </w:r>
+      <w:proofErr w:type="spellEnd"/>
+      <w:r>
+        <w:t xml:space="preserve"> </w:t>
+      </w:r>
+      <w:proofErr w:type="spellStart"/>
+      <w:r>
+        <w:t>charts</w:t>
+      </w:r>
+      <w:proofErr w:type="spellEnd"/>
+    </w:p>
+    <w:p>
+      <w:pPr>
+        <w:pStyle w:val="Listenabsatz"/>
+        <w:numPr>
+          <w:ilvl w:val="0"/>
+          <w:numId w:val="5"/>
+        </w:numPr>
+      </w:pPr>
+      <w:r>
+        <w:t xml:space="preserve">16 </w:t>
+      </w:r>
+      <w:proofErr w:type="spellStart"/>
+      <w:r>
+        <w:t>Minutes</w:t>
+      </w:r>
+      <w:proofErr w:type="spellEnd"/>
+      <w:r>
+        <w:t xml:space="preserve"> + 5 </w:t>
+      </w:r>
+      <w:proofErr w:type="spellStart"/>
+      <w:r>
+        <w:t>Minutes</w:t>
+      </w:r>
+      <w:proofErr w:type="spellEnd"/>
+      <w:r>
+        <w:t xml:space="preserve"> Q&amp;A</w:t>
+      </w:r>
+    </w:p>
+    <w:p>
+      <w:pPr>
+        <w:pStyle w:val="Listenabsatz"/>
+        <w:numPr>
+          <w:ilvl w:val="0"/>
+          <w:numId w:val="5"/>
+        </w:numPr>
+      </w:pPr>
+      <w:r>
+        <w:t xml:space="preserve">4-6 </w:t>
+      </w:r>
+      <w:proofErr w:type="spellStart"/>
+      <w:r>
+        <w:t>main</w:t>
+      </w:r>
+      <w:proofErr w:type="spellEnd"/>
+      <w:r>
+        <w:t xml:space="preserve"> </w:t>
+      </w:r>
+      <w:proofErr w:type="spellStart"/>
+      <w:r>
+        <w:t>charts</w:t>
+      </w:r>
+      <w:proofErr w:type="spellEnd"/>
+      <w:r>
+        <w:t xml:space="preserve"> (</w:t>
+      </w:r>
+      <w:proofErr w:type="spellStart"/>
+      <w:r>
+        <w:t>inlcuding</w:t>
+      </w:r>
+      <w:proofErr w:type="spellEnd"/>
+      <w:r>
+        <w:t xml:space="preserve"> </w:t>
+      </w:r>
+      <w:proofErr w:type="spellStart"/>
+      <w:r>
+        <w:t>relevance</w:t>
+      </w:r>
+      <w:proofErr w:type="spellEnd"/>
+      <w:r>
+        <w:t xml:space="preserve">, </w:t>
+      </w:r>
+      <w:proofErr w:type="spellStart"/>
+      <w:r>
+        <w:t>coding</w:t>
+      </w:r>
+      <w:proofErr w:type="spellEnd"/>
+      <w:r>
+        <w:t xml:space="preserve">, </w:t>
+      </w:r>
+      <w:proofErr w:type="spellStart"/>
+      <w:r>
+        <w:t>visualisation</w:t>
+      </w:r>
+      <w:proofErr w:type="spellEnd"/>
+      <w:r>
+        <w:t xml:space="preserve">, </w:t>
+      </w:r>
+      <w:proofErr w:type="spellStart"/>
+      <w:r>
+        <w:t>key</w:t>
+      </w:r>
+      <w:proofErr w:type="spellEnd"/>
+      <w:r>
+        <w:t xml:space="preserve"> </w:t>
+      </w:r>
+      <w:proofErr w:type="spellStart"/>
+      <w:r>
+        <w:t>take</w:t>
+      </w:r>
+      <w:proofErr w:type="spellEnd"/>
+      <w:r>
+        <w:t xml:space="preserve"> </w:t>
+      </w:r>
+      <w:proofErr w:type="spellStart"/>
+      <w:r>
+        <w:t>away</w:t>
+      </w:r>
+      <w:proofErr w:type="spellEnd"/>
+      <w:r>
+        <w:t xml:space="preserve">, </w:t>
+      </w:r>
+      <w:proofErr w:type="spellStart"/>
+      <w:r>
+        <w:t>answering</w:t>
+      </w:r>
+      <w:proofErr w:type="spellEnd"/>
+      <w:r>
+        <w:t xml:space="preserve"> </w:t>
+      </w:r>
+      <w:proofErr w:type="spellStart"/>
+      <w:r>
+        <w:t>the</w:t>
+      </w:r>
+      <w:proofErr w:type="spellEnd"/>
+      <w:r>
+        <w:t xml:space="preserve"> </w:t>
+      </w:r>
+      <w:proofErr w:type="spellStart"/>
+      <w:r>
+        <w:t>main</w:t>
+      </w:r>
+      <w:proofErr w:type="spellEnd"/>
+      <w:r>
+        <w:t xml:space="preserve"> </w:t>
+      </w:r>
+      <w:proofErr w:type="spellStart"/>
+      <w:r>
+        <w:t>questions</w:t>
+      </w:r>
+      <w:proofErr w:type="spellEnd"/>
+      <w:r>
+        <w:t>)</w:t>
+      </w:r>
+    </w:p>
+    <w:p/>
+    <w:p>
+      <w:r>
+        <w:t>Content</w:t>
+      </w:r>
+    </w:p>
+    <w:p>
+      <w:pPr>
+        <w:pStyle w:val="Listenabsatz"/>
+        <w:numPr>
+          <w:ilvl w:val="0"/>
+          <w:numId w:val="5"/>
+        </w:numPr>
+      </w:pPr>
+      <w:proofErr w:type="spellStart"/>
+      <w:r>
+        <w:t>Process</w:t>
+      </w:r>
+      <w:proofErr w:type="spellEnd"/>
+      <w:r>
+        <w:t>-Chart</w:t>
+      </w:r>
+    </w:p>
+    <w:p>
+      <w:pPr>
+        <w:pStyle w:val="Listenabsatz"/>
+        <w:numPr>
+          <w:ilvl w:val="0"/>
+          <w:numId w:val="5"/>
+        </w:numPr>
+      </w:pPr>
+      <w:r>
+        <w:t xml:space="preserve">Data </w:t>
+      </w:r>
+      <w:r>
+        <w:sym w:font="Wingdings" w:char="F0E0"/>
+      </w:r>
+      <w:r>
+        <w:t xml:space="preserve"> BFS</w:t>
+      </w:r>
+    </w:p>
+    <w:p>
+      <w:pPr>
+        <w:pStyle w:val="Listenabsatz"/>
+        <w:numPr>
+          <w:ilvl w:val="1"/>
+          <w:numId w:val="5"/>
+        </w:numPr>
+      </w:pPr>
+      <w:proofErr w:type="spellStart"/>
+      <w:r>
+        <w:t>Merging</w:t>
+      </w:r>
+      <w:proofErr w:type="spellEnd"/>
+    </w:p>
+    <w:p>
+      <w:pPr>
+        <w:pStyle w:val="Listenabsatz"/>
+        <w:numPr>
+          <w:ilvl w:val="1"/>
+          <w:numId w:val="5"/>
+        </w:numPr>
+      </w:pPr>
+      <w:r>
+        <w:t>Code</w:t>
+      </w:r>
+    </w:p>
+    <w:p>
+      <w:pPr>
+        <w:pStyle w:val="Listenabsatz"/>
+        <w:numPr>
+          <w:ilvl w:val="1"/>
+          <w:numId w:val="5"/>
+        </w:numPr>
+      </w:pPr>
+      <w:r>
+        <w:t>Verschiedene Datensätze</w:t>
+      </w:r>
+    </w:p>
+    <w:p>
+      <w:pPr>
+        <w:pStyle w:val="Listenabsatz"/>
+        <w:numPr>
+          <w:ilvl w:val="1"/>
+          <w:numId w:val="5"/>
+        </w:numPr>
+      </w:pPr>
+      <w:r>
+        <w:t>Main variables</w:t>
+      </w:r>
+    </w:p>
+    <w:p>
+      <w:pPr>
+        <w:pStyle w:val="Listenabsatz"/>
+        <w:numPr>
+          <w:ilvl w:val="0"/>
+          <w:numId w:val="5"/>
+        </w:numPr>
+      </w:pPr>
+      <w:proofErr w:type="spellStart"/>
+      <w:r>
+        <w:t>Presenting</w:t>
+      </w:r>
+      <w:proofErr w:type="spellEnd"/>
+      <w:r>
+        <w:t xml:space="preserve"> </w:t>
+      </w:r>
+      <w:proofErr w:type="spellStart"/>
+      <w:r>
+        <w:t>our</w:t>
+      </w:r>
+      <w:proofErr w:type="spellEnd"/>
+      <w:r>
+        <w:t xml:space="preserve"> </w:t>
+      </w:r>
+      <w:proofErr w:type="spellStart"/>
+      <w:r>
+        <w:t>main</w:t>
+      </w:r>
+      <w:proofErr w:type="spellEnd"/>
+      <w:r>
+        <w:t xml:space="preserve"> </w:t>
+      </w:r>
+      <w:proofErr w:type="spellStart"/>
+      <w:r>
+        <w:t>questions</w:t>
+      </w:r>
+      <w:proofErr w:type="spellEnd"/>
+    </w:p>
+    <w:p>
+      <w:pPr>
+        <w:pStyle w:val="Listenabsatz"/>
+        <w:numPr>
+          <w:ilvl w:val="1"/>
+          <w:numId w:val="5"/>
+        </w:numPr>
+      </w:pPr>
+      <w:r>
+        <w:t>Swiss Hospital Data</w:t>
+      </w:r>
+    </w:p>
+    <w:p>
+      <w:pPr>
+        <w:pStyle w:val="Listenabsatz"/>
+        <w:numPr>
+          <w:ilvl w:val="1"/>
+          <w:numId w:val="5"/>
+        </w:numPr>
+      </w:pPr>
+      <w:r>
+        <w:t xml:space="preserve">Development </w:t>
+      </w:r>
+      <w:proofErr w:type="spellStart"/>
+      <w:r>
+        <w:t>Statistics</w:t>
+      </w:r>
+      <w:proofErr w:type="spellEnd"/>
+    </w:p>
+    <w:p>
+      <w:pPr>
+        <w:pStyle w:val="Listenabsatz"/>
+        <w:numPr>
+          <w:ilvl w:val="1"/>
+          <w:numId w:val="5"/>
+        </w:numPr>
+      </w:pPr>
+      <w:r>
+        <w:t xml:space="preserve">Trends </w:t>
+      </w:r>
+      <w:proofErr w:type="spellStart"/>
+      <w:r>
+        <w:t>Statistics</w:t>
+      </w:r>
+      <w:proofErr w:type="spellEnd"/>
+      <w:r>
+        <w:t xml:space="preserve"> </w:t>
+      </w:r>
+      <w:r>
+        <w:sym w:font="Wingdings" w:char="F0E0"/>
+      </w:r>
+      <w:r>
+        <w:t xml:space="preserve"> </w:t>
+      </w:r>
+      <w:proofErr w:type="spellStart"/>
+      <w:r>
+        <w:t>focus</w:t>
+      </w:r>
+      <w:proofErr w:type="spellEnd"/>
+      <w:r>
+        <w:t xml:space="preserve"> on lack </w:t>
+      </w:r>
+      <w:proofErr w:type="spellStart"/>
+      <w:r>
+        <w:t>of</w:t>
+      </w:r>
+      <w:proofErr w:type="spellEnd"/>
+      <w:r>
+        <w:t xml:space="preserve"> </w:t>
+      </w:r>
+      <w:proofErr w:type="spellStart"/>
+      <w:r>
+        <w:t>knowlegde</w:t>
+      </w:r>
+      <w:proofErr w:type="spellEnd"/>
+      <w:r>
+        <w:t xml:space="preserve"> </w:t>
+      </w:r>
+      <w:proofErr w:type="spellStart"/>
+      <w:r>
+        <w:t>to</w:t>
+      </w:r>
+      <w:proofErr w:type="spellEnd"/>
+      <w:r>
+        <w:t xml:space="preserve"> </w:t>
+      </w:r>
+      <w:proofErr w:type="spellStart"/>
+      <w:r>
+        <w:t>interpret</w:t>
+      </w:r>
+      <w:proofErr w:type="spellEnd"/>
+      <w:r>
+        <w:t xml:space="preserve"> </w:t>
+      </w:r>
+      <w:proofErr w:type="spellStart"/>
+      <w:r>
+        <w:t>the</w:t>
+      </w:r>
+      <w:proofErr w:type="spellEnd"/>
+      <w:r>
+        <w:t xml:space="preserve"> regional </w:t>
+      </w:r>
+      <w:proofErr w:type="spellStart"/>
+      <w:r>
+        <w:t>differences</w:t>
+      </w:r>
+      <w:proofErr w:type="spellEnd"/>
+      <w:r>
+        <w:t xml:space="preserve">; but </w:t>
+      </w:r>
+      <w:proofErr w:type="spellStart"/>
+      <w:r>
+        <w:t>would</w:t>
+      </w:r>
+      <w:proofErr w:type="spellEnd"/>
+      <w:r>
+        <w:t xml:space="preserve"> </w:t>
+      </w:r>
+      <w:proofErr w:type="spellStart"/>
+      <w:r>
+        <w:t>be</w:t>
+      </w:r>
+      <w:proofErr w:type="spellEnd"/>
+      <w:r>
+        <w:t xml:space="preserve"> </w:t>
+      </w:r>
+      <w:proofErr w:type="spellStart"/>
+      <w:r>
+        <w:t>of</w:t>
+      </w:r>
+      <w:proofErr w:type="spellEnd"/>
+      <w:r>
+        <w:t xml:space="preserve"> </w:t>
+      </w:r>
+      <w:proofErr w:type="spellStart"/>
+      <w:r>
+        <w:t>huge</w:t>
+      </w:r>
+      <w:proofErr w:type="spellEnd"/>
+      <w:r>
+        <w:t xml:space="preserve"> </w:t>
+      </w:r>
+      <w:proofErr w:type="spellStart"/>
+      <w:r>
+        <w:t>interest</w:t>
+      </w:r>
+      <w:proofErr w:type="spellEnd"/>
+      <w:r>
+        <w:t xml:space="preserve"> </w:t>
+      </w:r>
+      <w:proofErr w:type="spellStart"/>
+      <w:r>
+        <w:t>to</w:t>
+      </w:r>
+      <w:proofErr w:type="spellEnd"/>
+      <w:r>
+        <w:t xml:space="preserve"> do </w:t>
+      </w:r>
+      <w:proofErr w:type="spellStart"/>
+      <w:r>
+        <w:t>some</w:t>
+      </w:r>
+      <w:proofErr w:type="spellEnd"/>
+      <w:r>
+        <w:t xml:space="preserve"> </w:t>
+      </w:r>
+      <w:proofErr w:type="spellStart"/>
+      <w:r>
+        <w:t>more</w:t>
+      </w:r>
+      <w:proofErr w:type="spellEnd"/>
+      <w:r>
+        <w:t xml:space="preserve"> </w:t>
+      </w:r>
+      <w:proofErr w:type="spellStart"/>
+      <w:r>
+        <w:t>research</w:t>
+      </w:r>
+      <w:proofErr w:type="spellEnd"/>
+      <w:r>
+        <w:t xml:space="preserve"> and </w:t>
+      </w:r>
+      <w:proofErr w:type="spellStart"/>
+      <w:r>
+        <w:t>understand</w:t>
+      </w:r>
+      <w:proofErr w:type="spellEnd"/>
+      <w:r>
+        <w:t xml:space="preserve"> </w:t>
+      </w:r>
+      <w:proofErr w:type="spellStart"/>
+      <w:r>
+        <w:t>the</w:t>
+      </w:r>
+      <w:proofErr w:type="spellEnd"/>
+      <w:r>
+        <w:t xml:space="preserve"> </w:t>
+      </w:r>
+      <w:proofErr w:type="spellStart"/>
+      <w:r>
+        <w:t>significant</w:t>
+      </w:r>
+      <w:proofErr w:type="spellEnd"/>
+      <w:r>
+        <w:t xml:space="preserve"> </w:t>
+      </w:r>
+      <w:proofErr w:type="spellStart"/>
+      <w:r>
+        <w:t>differences</w:t>
+      </w:r>
+      <w:proofErr w:type="spellEnd"/>
+    </w:p>
+    <w:p>
+      <w:pPr>
+        <w:pStyle w:val="Listenabsatz"/>
+        <w:numPr>
+          <w:ilvl w:val="1"/>
+          <w:numId w:val="5"/>
+        </w:numPr>
+      </w:pPr>
+      <w:r>
+        <w:t xml:space="preserve">Tessin? </w:t>
+      </w:r>
+      <w:r>
+        <w:sym w:font="Wingdings" w:char="F0E0"/>
+      </w:r>
+      <w:r>
+        <w:t xml:space="preserve"> Personalmangel</w:t>
+      </w:r>
+      <w:r>
+        <w:t xml:space="preserve"> und finanzielle Limitation</w:t>
+      </w:r>
+    </w:p>
+    <w:p>
+      <w:pPr>
+        <w:pStyle w:val="Listenabsatz"/>
+        <w:numPr>
+          <w:ilvl w:val="2"/>
+          <w:numId w:val="5"/>
+        </w:numPr>
+      </w:pPr>
+      <w:proofErr w:type="spellStart"/>
+      <w:r>
+        <w:t>Reserach</w:t>
+      </w:r>
+      <w:proofErr w:type="spellEnd"/>
+      <w:r>
+        <w:t>!</w:t>
+      </w:r>
+    </w:p>
+    <w:p>
+      <w:pPr>
+        <w:pStyle w:val="Listenabsatz"/>
+        <w:numPr>
+          <w:ilvl w:val="1"/>
+          <w:numId w:val="5"/>
+        </w:numPr>
+      </w:pPr>
+      <w:proofErr w:type="spellStart"/>
+      <w:r>
+        <w:t>DiD</w:t>
+      </w:r>
+      <w:proofErr w:type="spellEnd"/>
+      <w:r>
+        <w:t xml:space="preserve"> in </w:t>
+      </w:r>
+      <w:proofErr w:type="spellStart"/>
+      <w:r>
+        <w:t>examinations</w:t>
+      </w:r>
+      <w:proofErr w:type="spellEnd"/>
+      <w:r>
+        <w:t xml:space="preserve"> per </w:t>
+      </w:r>
+      <w:proofErr w:type="spellStart"/>
+      <w:r>
+        <w:t>device</w:t>
+      </w:r>
+      <w:proofErr w:type="spellEnd"/>
+    </w:p>
+    <w:p>
+      <w:pPr>
+        <w:pStyle w:val="Listenabsatz"/>
+        <w:numPr>
+          <w:ilvl w:val="1"/>
+          <w:numId w:val="5"/>
+        </w:numPr>
+      </w:pPr>
+      <w:proofErr w:type="spellStart"/>
+      <w:r>
+        <w:t>Regressino</w:t>
+      </w:r>
+      <w:proofErr w:type="spellEnd"/>
+      <w:r>
+        <w:t xml:space="preserve">: </w:t>
+      </w:r>
+      <w:proofErr w:type="spellStart"/>
+      <w:r>
+        <w:t>Two</w:t>
+      </w:r>
+      <w:proofErr w:type="spellEnd"/>
+      <w:r>
+        <w:t xml:space="preserve"> </w:t>
+      </w:r>
+      <w:proofErr w:type="spellStart"/>
+      <w:r>
+        <w:t>way</w:t>
+      </w:r>
+      <w:proofErr w:type="spellEnd"/>
+      <w:r>
+        <w:t xml:space="preserve"> </w:t>
+      </w:r>
+      <w:proofErr w:type="spellStart"/>
+      <w:r>
+        <w:t>fixed</w:t>
+      </w:r>
+      <w:proofErr w:type="spellEnd"/>
+      <w:r>
+        <w:t xml:space="preserve"> </w:t>
+      </w:r>
+      <w:proofErr w:type="spellStart"/>
+      <w:r>
+        <w:t>effects</w:t>
+      </w:r>
+      <w:proofErr w:type="spellEnd"/>
+      <w:r>
+        <w:t xml:space="preserve"> </w:t>
+      </w:r>
+      <w:proofErr w:type="spellStart"/>
+      <w:r>
+        <w:t>as</w:t>
+      </w:r>
+      <w:proofErr w:type="spellEnd"/>
+      <w:r>
+        <w:t xml:space="preserve"> </w:t>
+      </w:r>
+      <w:proofErr w:type="spellStart"/>
+      <w:r>
+        <w:t>main</w:t>
+      </w:r>
+      <w:proofErr w:type="spellEnd"/>
+      <w:r>
+        <w:t xml:space="preserve"> </w:t>
+      </w:r>
+      <w:proofErr w:type="spellStart"/>
+      <w:r>
+        <w:t>focus</w:t>
+      </w:r>
+      <w:proofErr w:type="spellEnd"/>
+    </w:p>
+    <w:p>
+      <w:pPr>
+        <w:pStyle w:val="Listenabsatz"/>
+        <w:numPr>
+          <w:ilvl w:val="0"/>
+          <w:numId w:val="5"/>
+        </w:numPr>
+      </w:pPr>
+      <w:proofErr w:type="spellStart"/>
+      <w:r>
+        <w:t>Legère</w:t>
+      </w:r>
+      <w:proofErr w:type="spellEnd"/>
+      <w:r>
+        <w:t xml:space="preserve"> Überleitung </w:t>
+      </w:r>
+      <w:r>
+        <w:sym w:font="Wingdings" w:char="F0E0"/>
+      </w:r>
+      <w:r>
+        <w:t xml:space="preserve"> in </w:t>
+      </w:r>
+      <w:proofErr w:type="spellStart"/>
+      <w:r>
+        <w:t>Dashy</w:t>
+      </w:r>
+      <w:proofErr w:type="spellEnd"/>
+    </w:p>
+    <w:p>
+      <w:pPr>
+        <w:pStyle w:val="Listenabsatz"/>
+        <w:numPr>
+          <w:ilvl w:val="0"/>
+          <w:numId w:val="5"/>
+        </w:numPr>
+      </w:pPr>
+      <w:r>
+        <w:lastRenderedPageBreak/>
+        <w:t xml:space="preserve"> Dashboard – </w:t>
+      </w:r>
+      <w:proofErr w:type="spellStart"/>
+      <w:r>
+        <w:t>Overview</w:t>
+      </w:r>
+      <w:proofErr w:type="spellEnd"/>
+    </w:p>
+    <w:p>
+      <w:pPr>
+        <w:pStyle w:val="Listenabsatz"/>
+        <w:numPr>
+          <w:ilvl w:val="1"/>
+          <w:numId w:val="5"/>
+        </w:numPr>
+      </w:pPr>
+      <w:proofErr w:type="spellStart"/>
+      <w:r>
+        <w:t>Synthetical</w:t>
+      </w:r>
+      <w:proofErr w:type="spellEnd"/>
+      <w:r>
+        <w:t xml:space="preserve"> Data </w:t>
+      </w:r>
+      <w:r>
+        <w:sym w:font="Wingdings" w:char="F0E0"/>
+      </w:r>
+      <w:r>
+        <w:t xml:space="preserve"> not </w:t>
+      </w:r>
+      <w:proofErr w:type="spellStart"/>
+      <w:r>
+        <w:t>for</w:t>
+      </w:r>
+      <w:proofErr w:type="spellEnd"/>
+      <w:r>
+        <w:t xml:space="preserve"> formal </w:t>
+      </w:r>
+      <w:proofErr w:type="spellStart"/>
+      <w:r>
+        <w:t>interpretation</w:t>
+      </w:r>
+      <w:proofErr w:type="spellEnd"/>
+    </w:p>
+    <w:p>
+      <w:pPr>
+        <w:pStyle w:val="Listenabsatz"/>
+        <w:numPr>
+          <w:ilvl w:val="1"/>
+          <w:numId w:val="5"/>
+        </w:numPr>
+      </w:pPr>
+      <w:proofErr w:type="spellStart"/>
+      <w:r>
+        <w:t>Aim</w:t>
+      </w:r>
+      <w:proofErr w:type="spellEnd"/>
+      <w:r>
+        <w:t xml:space="preserve"> oft he </w:t>
+      </w:r>
+      <w:proofErr w:type="spellStart"/>
+      <w:r>
+        <w:t>Dashy</w:t>
+      </w:r>
+      <w:proofErr w:type="spellEnd"/>
+    </w:p>
+    <w:p>
+      <w:pPr>
+        <w:pStyle w:val="Listenabsatz"/>
+        <w:numPr>
+          <w:ilvl w:val="1"/>
+          <w:numId w:val="5"/>
+        </w:numPr>
+      </w:pPr>
+      <w:proofErr w:type="spellStart"/>
+      <w:r>
+        <w:t>Describing</w:t>
+      </w:r>
+      <w:proofErr w:type="spellEnd"/>
+      <w:r>
+        <w:t xml:space="preserve"> different </w:t>
+      </w:r>
+      <w:proofErr w:type="spellStart"/>
+      <w:r>
+        <w:t>numers</w:t>
+      </w:r>
+      <w:proofErr w:type="spellEnd"/>
+      <w:r>
+        <w:t xml:space="preserve"> and </w:t>
+      </w:r>
+      <w:proofErr w:type="spellStart"/>
+      <w:r>
+        <w:t>graphics</w:t>
+      </w:r>
+      <w:proofErr w:type="spellEnd"/>
+      <w:r>
+        <w:t xml:space="preserve"> </w:t>
+      </w:r>
+      <w:proofErr w:type="spellStart"/>
+      <w:r>
+        <w:t>by</w:t>
+      </w:r>
+      <w:proofErr w:type="spellEnd"/>
+      <w:r>
+        <w:t xml:space="preserve"> different </w:t>
+      </w:r>
+      <w:proofErr w:type="spellStart"/>
+      <w:r>
+        <w:t>months</w:t>
+      </w:r>
+      <w:proofErr w:type="spellEnd"/>
+    </w:p>
+    <w:p>
+      <w:pPr>
+        <w:pStyle w:val="Listenabsatz"/>
+        <w:numPr>
+          <w:ilvl w:val="1"/>
+          <w:numId w:val="5"/>
+        </w:numPr>
+      </w:pPr>
+      <w:r>
+        <w:t xml:space="preserve">0 – 1 Dummy live </w:t>
+      </w:r>
+      <w:proofErr w:type="spellStart"/>
+      <w:r>
+        <w:t>coding</w:t>
+      </w:r>
+      <w:proofErr w:type="spellEnd"/>
+      <w:r>
+        <w:t xml:space="preserve"> </w:t>
+      </w:r>
+      <w:proofErr w:type="spellStart"/>
+      <w:r>
+        <w:t>by</w:t>
+      </w:r>
+      <w:proofErr w:type="spellEnd"/>
+      <w:r>
+        <w:t xml:space="preserve"> </w:t>
+      </w:r>
+      <w:proofErr w:type="spellStart"/>
+      <w:r>
+        <w:t>jeremy</w:t>
+      </w:r>
+      <w:proofErr w:type="spellEnd"/>
+      <w:r>
+        <w:t xml:space="preserve"> </w:t>
+      </w:r>
+      <w:proofErr w:type="spellStart"/>
+      <w:r>
+        <w:t>stieger</w:t>
+      </w:r>
+      <w:proofErr w:type="spellEnd"/>
+    </w:p>
+    <w:p>
+      <w:pPr>
+        <w:pStyle w:val="Listenabsatz"/>
+        <w:numPr>
+          <w:ilvl w:val="1"/>
+          <w:numId w:val="5"/>
+        </w:numPr>
+      </w:pPr>
+      <w:r>
+        <w:t>Eventuell Dezember davor auslassen und dann vor Ort hinzufügen?!</w:t>
+      </w:r>
+    </w:p>
+    <w:p>
+      <w:pPr>
+        <w:pStyle w:val="Listenabsatz"/>
+        <w:numPr>
+          <w:ilvl w:val="1"/>
+          <w:numId w:val="5"/>
+        </w:numPr>
+      </w:pPr>
+    </w:p>
     <w:sectPr>
       <w:pgSz w:w="11906" w:h="16838"/>
       <w:pgMar w:top="1417" w:right="1417" w:bottom="1134" w:left="1417" w:header="708" w:footer="708" w:gutter="0"/>
@@ -761,7 +2807,7 @@
         <w:rFonts w:ascii="Aptos" w:eastAsiaTheme="minorHAnsi" w:hAnsi="Aptos" w:cstheme="minorBidi" w:hint="default"/>
       </w:rPr>
     </w:lvl>
-    <w:lvl w:ilvl="1" w:tplc="04070003" w:tentative="1">
+    <w:lvl w:ilvl="1" w:tplc="04070003">
       <w:start w:val="1"/>
       <w:numFmt w:val="bullet"/>
       <w:lvlText w:val="o"/>
@@ -773,7 +2819,7 @@
         <w:rFonts w:ascii="Courier New" w:hAnsi="Courier New" w:cs="Courier New" w:hint="default"/>
       </w:rPr>
     </w:lvl>
-    <w:lvl w:ilvl="2" w:tplc="04070005" w:tentative="1">
+    <w:lvl w:ilvl="2" w:tplc="04070005">
       <w:start w:val="1"/>
       <w:numFmt w:val="bullet"/>
       <w:lvlText w:val=""/>

</xml_diff>

<commit_message>
changed todo file for tomoroww
</commit_message>
<xml_diff>
--- a/schedule/open_todos_06.11.docx
+++ b/schedule/open_todos_06.11.docx
@@ -794,24 +794,28 @@
           <w:numId w:val="5"/>
         </w:numPr>
         <w:rPr>
-          <w:color w:val="F2CEED" w:themeColor="accent5" w:themeTint="33"/>
-        </w:rPr>
-      </w:pPr>
-      <w:r>
-        <w:rPr>
-          <w:color w:val="F2CEED" w:themeColor="accent5" w:themeTint="33"/>
+          <w:strike/>
+          <w:color w:val="D86DCB" w:themeColor="accent5" w:themeTint="99"/>
+        </w:rPr>
+      </w:pPr>
+      <w:r>
+        <w:rPr>
+          <w:strike/>
+          <w:color w:val="D86DCB" w:themeColor="accent5" w:themeTint="99"/>
         </w:rPr>
         <w:t xml:space="preserve">Swiss Hospital Data </w:t>
       </w:r>
       <w:r>
         <w:rPr>
-          <w:color w:val="F2CEED" w:themeColor="accent5" w:themeTint="33"/>
+          <w:strike/>
+          <w:color w:val="D86DCB" w:themeColor="accent5" w:themeTint="99"/>
         </w:rPr>
         <w:sym w:font="Wingdings" w:char="F0E0"/>
       </w:r>
       <w:r>
         <w:rPr>
-          <w:color w:val="F2CEED" w:themeColor="accent5" w:themeTint="33"/>
+          <w:strike/>
+          <w:color w:val="D86DCB" w:themeColor="accent5" w:themeTint="99"/>
         </w:rPr>
         <w:t xml:space="preserve"> Linear Regression Tab; Size</w:t>
       </w:r>
@@ -824,11 +828,13 @@
           <w:numId w:val="5"/>
         </w:numPr>
         <w:rPr>
+          <w:strike/>
           <w:color w:val="D86DCB" w:themeColor="accent5" w:themeTint="99"/>
         </w:rPr>
       </w:pPr>
       <w:r>
         <w:rPr>
+          <w:strike/>
           <w:color w:val="D86DCB" w:themeColor="accent5" w:themeTint="99"/>
         </w:rPr>
         <w:t>Neuer Name für «</w:t>
@@ -836,6 +842,7 @@
       <w:proofErr w:type="spellStart"/>
       <w:r>
         <w:rPr>
+          <w:strike/>
           <w:color w:val="D86DCB" w:themeColor="accent5" w:themeTint="99"/>
         </w:rPr>
         <w:t>Beddays</w:t>
@@ -843,6 +850,7 @@
       <w:proofErr w:type="spellEnd"/>
       <w:r>
         <w:rPr>
+          <w:strike/>
           <w:color w:val="D86DCB" w:themeColor="accent5" w:themeTint="99"/>
         </w:rPr>
         <w:t>» &amp; Farbe der Regressionslinie ändern</w:t>
@@ -887,6 +895,24 @@
         </w:rPr>
         <w:t xml:space="preserve"> interpretiert werden, Wieso? Was wurde gemacht? FE &amp; Ausreisser entfernt teilweise</w:t>
       </w:r>
+      <w:r>
+        <w:rPr>
+          <w:color w:val="D86DCB" w:themeColor="accent5" w:themeTint="99"/>
+        </w:rPr>
+        <w:t xml:space="preserve"> </w:t>
+      </w:r>
+      <w:r>
+        <w:rPr>
+          <w:color w:val="D86DCB" w:themeColor="accent5" w:themeTint="99"/>
+        </w:rPr>
+        <w:sym w:font="Wingdings" w:char="F0E0"/>
+      </w:r>
+      <w:r>
+        <w:rPr>
+          <w:color w:val="D86DCB" w:themeColor="accent5" w:themeTint="99"/>
+        </w:rPr>
+        <w:t xml:space="preserve"> morgen</w:t>
+      </w:r>
     </w:p>
     <w:p>
       <w:pPr>
@@ -896,6 +922,92 @@
           <w:numId w:val="5"/>
         </w:numPr>
         <w:rPr>
+          <w:color w:val="F2CEED" w:themeColor="accent5" w:themeTint="33"/>
+        </w:rPr>
+      </w:pPr>
+      <w:r>
+        <w:rPr>
+          <w:color w:val="F2CEED" w:themeColor="accent5" w:themeTint="33"/>
+        </w:rPr>
+        <w:t xml:space="preserve">Beim Datensatz noch </w:t>
+      </w:r>
+      <w:proofErr w:type="spellStart"/>
+      <w:r>
+        <w:rPr>
+          <w:color w:val="F2CEED" w:themeColor="accent5" w:themeTint="33"/>
+        </w:rPr>
+        <w:t>none</w:t>
+      </w:r>
+      <w:proofErr w:type="spellEnd"/>
+      <w:r>
+        <w:rPr>
+          <w:color w:val="F2CEED" w:themeColor="accent5" w:themeTint="33"/>
+        </w:rPr>
+        <w:t xml:space="preserve"> durch X ersetzen?</w:t>
+      </w:r>
+      <w:r>
+        <w:rPr>
+          <w:color w:val="F2CEED" w:themeColor="accent5" w:themeTint="33"/>
+        </w:rPr>
+        <w:t xml:space="preserve"> </w:t>
+      </w:r>
+      <w:r>
+        <w:rPr>
+          <w:color w:val="F2CEED" w:themeColor="accent5" w:themeTint="33"/>
+        </w:rPr>
+        <w:sym w:font="Wingdings" w:char="F0E0"/>
+      </w:r>
+      <w:r>
+        <w:rPr>
+          <w:color w:val="F2CEED" w:themeColor="accent5" w:themeTint="33"/>
+        </w:rPr>
+        <w:t xml:space="preserve"> morgen</w:t>
+      </w:r>
+    </w:p>
+    <w:p>
+      <w:pPr>
+        <w:pStyle w:val="Listenabsatz"/>
+        <w:numPr>
+          <w:ilvl w:val="0"/>
+          <w:numId w:val="5"/>
+        </w:numPr>
+        <w:rPr>
+          <w:color w:val="F2CEED" w:themeColor="accent5" w:themeTint="33"/>
+        </w:rPr>
+      </w:pPr>
+      <w:r>
+        <w:rPr>
+          <w:color w:val="F2CEED" w:themeColor="accent5" w:themeTint="33"/>
+        </w:rPr>
+        <w:t>Zeichnung und Bild rein</w:t>
+      </w:r>
+      <w:r>
+        <w:rPr>
+          <w:color w:val="F2CEED" w:themeColor="accent5" w:themeTint="33"/>
+        </w:rPr>
+        <w:t xml:space="preserve"> </w:t>
+      </w:r>
+      <w:r>
+        <w:rPr>
+          <w:color w:val="F2CEED" w:themeColor="accent5" w:themeTint="33"/>
+        </w:rPr>
+        <w:sym w:font="Wingdings" w:char="F0E0"/>
+      </w:r>
+      <w:r>
+        <w:rPr>
+          <w:color w:val="F2CEED" w:themeColor="accent5" w:themeTint="33"/>
+        </w:rPr>
+        <w:t xml:space="preserve"> morgen</w:t>
+      </w:r>
+    </w:p>
+    <w:p>
+      <w:pPr>
+        <w:pStyle w:val="Listenabsatz"/>
+        <w:numPr>
+          <w:ilvl w:val="0"/>
+          <w:numId w:val="5"/>
+        </w:numPr>
+        <w:rPr>
           <w:color w:val="D86DCB" w:themeColor="accent5" w:themeTint="99"/>
         </w:rPr>
       </w:pPr>
@@ -903,21 +1015,19 @@
         <w:rPr>
           <w:color w:val="D86DCB" w:themeColor="accent5" w:themeTint="99"/>
         </w:rPr>
-        <w:t xml:space="preserve">Beim Datensatz noch </w:t>
-      </w:r>
-      <w:proofErr w:type="spellStart"/>
+        <w:t>(</w:t>
+      </w:r>
       <w:r>
         <w:rPr>
           <w:color w:val="D86DCB" w:themeColor="accent5" w:themeTint="99"/>
         </w:rPr>
-        <w:t>none</w:t>
-      </w:r>
-      <w:proofErr w:type="spellEnd"/>
+        <w:t>Konfidenzintervall bei Regressionen</w:t>
+      </w:r>
       <w:r>
         <w:rPr>
           <w:color w:val="D86DCB" w:themeColor="accent5" w:themeTint="99"/>
         </w:rPr>
-        <w:t xml:space="preserve"> durch X ersetzen?</w:t>
+        <w:t>)</w:t>
       </w:r>
     </w:p>
     <w:p>
@@ -928,14 +1038,30 @@
           <w:numId w:val="5"/>
         </w:numPr>
         <w:rPr>
+          <w:strike/>
           <w:color w:val="D86DCB" w:themeColor="accent5" w:themeTint="99"/>
         </w:rPr>
       </w:pPr>
       <w:r>
         <w:rPr>
+          <w:strike/>
           <w:color w:val="D86DCB" w:themeColor="accent5" w:themeTint="99"/>
         </w:rPr>
-        <w:t>Zeichnung und Bild rein</w:t>
+        <w:t xml:space="preserve">Einfärben von Region-Datenpunkte </w:t>
+      </w:r>
+      <w:r>
+        <w:rPr>
+          <w:strike/>
+          <w:color w:val="D86DCB" w:themeColor="accent5" w:themeTint="99"/>
+        </w:rPr>
+        <w:sym w:font="Wingdings" w:char="F0E0"/>
+      </w:r>
+      <w:r>
+        <w:rPr>
+          <w:strike/>
+          <w:color w:val="D86DCB" w:themeColor="accent5" w:themeTint="99"/>
+        </w:rPr>
+        <w:t xml:space="preserve"> Regression</w:t>
       </w:r>
     </w:p>
     <w:p>
@@ -946,14 +1072,32 @@
           <w:numId w:val="5"/>
         </w:numPr>
         <w:rPr>
-          <w:color w:val="D86DCB" w:themeColor="accent5" w:themeTint="99"/>
-        </w:rPr>
-      </w:pPr>
-      <w:r>
-        <w:rPr>
-          <w:color w:val="D86DCB" w:themeColor="accent5" w:themeTint="99"/>
-        </w:rPr>
-        <w:t>Konfidenzintervall bei Regressionen</w:t>
+          <w:strike/>
+          <w:color w:val="F2CEED" w:themeColor="accent5" w:themeTint="33"/>
+        </w:rPr>
+      </w:pPr>
+      <w:r>
+        <w:rPr>
+          <w:strike/>
+          <w:color w:val="F2CEED" w:themeColor="accent5" w:themeTint="33"/>
+        </w:rPr>
+        <w:t xml:space="preserve">Regional </w:t>
+      </w:r>
+      <w:proofErr w:type="spellStart"/>
+      <w:r>
+        <w:rPr>
+          <w:strike/>
+          <w:color w:val="F2CEED" w:themeColor="accent5" w:themeTint="33"/>
+        </w:rPr>
+        <w:t>Structure</w:t>
+      </w:r>
+      <w:proofErr w:type="spellEnd"/>
+      <w:r>
+        <w:rPr>
+          <w:strike/>
+          <w:color w:val="F2CEED" w:themeColor="accent5" w:themeTint="33"/>
+        </w:rPr>
+        <w:t xml:space="preserve"> Trend</w:t>
       </w:r>
     </w:p>
     <w:p>
@@ -963,27 +1107,244 @@
           <w:ilvl w:val="0"/>
           <w:numId w:val="5"/>
         </w:numPr>
-        <w:rPr>
-          <w:color w:val="D86DCB" w:themeColor="accent5" w:themeTint="99"/>
-        </w:rPr>
-      </w:pPr>
-      <w:r>
-        <w:rPr>
-          <w:color w:val="D86DCB" w:themeColor="accent5" w:themeTint="99"/>
-        </w:rPr>
-        <w:t xml:space="preserve">Einfärben von Region-Datenpunkte </w:t>
-      </w:r>
-      <w:r>
-        <w:rPr>
-          <w:color w:val="D86DCB" w:themeColor="accent5" w:themeTint="99"/>
+      </w:pPr>
+      <w:r>
+        <w:rPr>
+          <w:color w:val="0F9ED5" w:themeColor="accent4"/>
+        </w:rPr>
+        <w:t xml:space="preserve">Home: 4-5 </w:t>
+      </w:r>
+      <w:proofErr w:type="spellStart"/>
+      <w:r>
+        <w:rPr>
+          <w:color w:val="0F9ED5" w:themeColor="accent4"/>
+        </w:rPr>
+        <w:t>business</w:t>
+      </w:r>
+      <w:proofErr w:type="spellEnd"/>
+      <w:r>
+        <w:rPr>
+          <w:color w:val="0F9ED5" w:themeColor="accent4"/>
+        </w:rPr>
+        <w:t xml:space="preserve"> </w:t>
+      </w:r>
+      <w:proofErr w:type="spellStart"/>
+      <w:r>
+        <w:rPr>
+          <w:color w:val="0F9ED5" w:themeColor="accent4"/>
+        </w:rPr>
+        <w:t>questions</w:t>
+      </w:r>
+      <w:proofErr w:type="spellEnd"/>
+    </w:p>
+    <w:p>
+      <w:pPr>
+        <w:pStyle w:val="Listenabsatz"/>
+        <w:numPr>
+          <w:ilvl w:val="0"/>
+          <w:numId w:val="5"/>
+        </w:numPr>
+        <w:rPr>
+          <w:color w:val="0F9ED5" w:themeColor="accent4"/>
+        </w:rPr>
+      </w:pPr>
+      <w:r>
+        <w:rPr>
+          <w:color w:val="0F9ED5" w:themeColor="accent4"/>
+        </w:rPr>
+        <w:t xml:space="preserve">Summary </w:t>
+      </w:r>
+      <w:proofErr w:type="spellStart"/>
+      <w:r>
+        <w:rPr>
+          <w:color w:val="0F9ED5" w:themeColor="accent4"/>
+        </w:rPr>
+        <w:t>of</w:t>
+      </w:r>
+      <w:proofErr w:type="spellEnd"/>
+      <w:r>
+        <w:rPr>
+          <w:color w:val="0F9ED5" w:themeColor="accent4"/>
+        </w:rPr>
+        <w:t xml:space="preserve"> </w:t>
+      </w:r>
+      <w:proofErr w:type="spellStart"/>
+      <w:r>
+        <w:rPr>
+          <w:color w:val="0F9ED5" w:themeColor="accent4"/>
+        </w:rPr>
+        <w:t>key</w:t>
+      </w:r>
+      <w:proofErr w:type="spellEnd"/>
+      <w:r>
+        <w:rPr>
+          <w:color w:val="0F9ED5" w:themeColor="accent4"/>
+        </w:rPr>
+        <w:t xml:space="preserve"> </w:t>
+      </w:r>
+      <w:proofErr w:type="spellStart"/>
+      <w:r>
+        <w:rPr>
+          <w:color w:val="0F9ED5" w:themeColor="accent4"/>
+        </w:rPr>
+        <w:t>visuals</w:t>
+      </w:r>
+      <w:proofErr w:type="spellEnd"/>
+      <w:r>
+        <w:rPr>
+          <w:color w:val="0F9ED5" w:themeColor="accent4"/>
+        </w:rPr>
+        <w:t xml:space="preserve"> and </w:t>
+      </w:r>
+      <w:proofErr w:type="spellStart"/>
+      <w:r>
+        <w:rPr>
+          <w:color w:val="0F9ED5" w:themeColor="accent4"/>
+        </w:rPr>
+        <w:t>take</w:t>
+      </w:r>
+      <w:proofErr w:type="spellEnd"/>
+      <w:r>
+        <w:rPr>
+          <w:color w:val="0F9ED5" w:themeColor="accent4"/>
+        </w:rPr>
+        <w:t xml:space="preserve"> </w:t>
+      </w:r>
+      <w:proofErr w:type="spellStart"/>
+      <w:r>
+        <w:rPr>
+          <w:color w:val="0F9ED5" w:themeColor="accent4"/>
+        </w:rPr>
+        <w:t>home</w:t>
+      </w:r>
+      <w:proofErr w:type="spellEnd"/>
+      <w:r>
+        <w:rPr>
+          <w:color w:val="0F9ED5" w:themeColor="accent4"/>
+        </w:rPr>
+        <w:t xml:space="preserve"> </w:t>
+      </w:r>
+      <w:proofErr w:type="spellStart"/>
+      <w:r>
+        <w:rPr>
+          <w:color w:val="0F9ED5" w:themeColor="accent4"/>
+        </w:rPr>
+        <w:t>messages</w:t>
+      </w:r>
+      <w:proofErr w:type="spellEnd"/>
+    </w:p>
+    <w:p>
+      <w:pPr>
+        <w:pStyle w:val="Listenabsatz"/>
+        <w:numPr>
+          <w:ilvl w:val="0"/>
+          <w:numId w:val="5"/>
+        </w:numPr>
+        <w:rPr>
+          <w:color w:val="0F9ED5" w:themeColor="accent4"/>
+        </w:rPr>
+      </w:pPr>
+      <w:r>
+        <w:rPr>
+          <w:color w:val="0F9ED5" w:themeColor="accent4"/>
+        </w:rPr>
+        <w:t xml:space="preserve">More explicit </w:t>
+      </w:r>
+      <w:proofErr w:type="spellStart"/>
+      <w:r>
+        <w:rPr>
+          <w:color w:val="0F9ED5" w:themeColor="accent4"/>
+        </w:rPr>
+        <w:t>description</w:t>
+      </w:r>
+      <w:proofErr w:type="spellEnd"/>
+      <w:r>
+        <w:rPr>
+          <w:color w:val="0F9ED5" w:themeColor="accent4"/>
+        </w:rPr>
+        <w:t xml:space="preserve"> on </w:t>
+      </w:r>
+      <w:proofErr w:type="spellStart"/>
+      <w:r>
+        <w:rPr>
+          <w:color w:val="0F9ED5" w:themeColor="accent4"/>
+        </w:rPr>
+        <w:t>our</w:t>
+      </w:r>
+      <w:proofErr w:type="spellEnd"/>
+      <w:r>
+        <w:rPr>
+          <w:color w:val="0F9ED5" w:themeColor="accent4"/>
+        </w:rPr>
+        <w:t xml:space="preserve"> </w:t>
+      </w:r>
+      <w:proofErr w:type="spellStart"/>
+      <w:r>
+        <w:rPr>
+          <w:color w:val="0F9ED5" w:themeColor="accent4"/>
+        </w:rPr>
+        <w:t>starting</w:t>
+      </w:r>
+      <w:proofErr w:type="spellEnd"/>
+      <w:r>
+        <w:rPr>
+          <w:color w:val="0F9ED5" w:themeColor="accent4"/>
+        </w:rPr>
+        <w:t xml:space="preserve"> </w:t>
+      </w:r>
+      <w:proofErr w:type="spellStart"/>
+      <w:r>
+        <w:rPr>
+          <w:color w:val="0F9ED5" w:themeColor="accent4"/>
+        </w:rPr>
+        <w:t>page</w:t>
+      </w:r>
+      <w:proofErr w:type="spellEnd"/>
+      <w:r>
+        <w:rPr>
+          <w:color w:val="0F9ED5" w:themeColor="accent4"/>
+        </w:rPr>
+        <w:t xml:space="preserve"> </w:t>
+      </w:r>
+      <w:r>
+        <w:rPr>
+          <w:color w:val="0F9ED5" w:themeColor="accent4"/>
         </w:rPr>
         <w:sym w:font="Wingdings" w:char="F0E0"/>
       </w:r>
       <w:r>
         <w:rPr>
-          <w:color w:val="D86DCB" w:themeColor="accent5" w:themeTint="99"/>
-        </w:rPr>
-        <w:t xml:space="preserve"> Regression</w:t>
+          <w:color w:val="0F9ED5" w:themeColor="accent4"/>
+        </w:rPr>
+        <w:t xml:space="preserve"> «</w:t>
+      </w:r>
+      <w:proofErr w:type="spellStart"/>
+      <w:r>
+        <w:rPr>
+          <w:color w:val="0F9ED5" w:themeColor="accent4"/>
+        </w:rPr>
+        <w:t>s’chind</w:t>
+      </w:r>
+      <w:proofErr w:type="spellEnd"/>
+      <w:r>
+        <w:rPr>
+          <w:color w:val="0F9ED5" w:themeColor="accent4"/>
+        </w:rPr>
+        <w:t xml:space="preserve"> bim </w:t>
+      </w:r>
+      <w:proofErr w:type="spellStart"/>
+      <w:r>
+        <w:rPr>
+          <w:color w:val="0F9ED5" w:themeColor="accent4"/>
+        </w:rPr>
+        <w:t>name</w:t>
+      </w:r>
+      <w:proofErr w:type="spellEnd"/>
+      <w:r>
+        <w:rPr>
+          <w:color w:val="0F9ED5" w:themeColor="accent4"/>
+        </w:rPr>
+        <w:t xml:space="preserve"> nenne»</w:t>
       </w:r>
     </w:p>
     <w:p>
@@ -994,29 +1355,133 @@
           <w:numId w:val="5"/>
         </w:numPr>
         <w:rPr>
-          <w:color w:val="F2CEED" w:themeColor="accent5" w:themeTint="33"/>
-        </w:rPr>
-      </w:pPr>
-      <w:r>
-        <w:rPr>
-          <w:color w:val="F2CEED" w:themeColor="accent5" w:themeTint="33"/>
-        </w:rPr>
-        <w:t xml:space="preserve">Regional </w:t>
-      </w:r>
-      <w:proofErr w:type="spellStart"/>
-      <w:r>
-        <w:rPr>
-          <w:color w:val="F2CEED" w:themeColor="accent5" w:themeTint="33"/>
-        </w:rPr>
-        <w:t>Structure</w:t>
-      </w:r>
-      <w:proofErr w:type="spellEnd"/>
-      <w:r>
-        <w:rPr>
-          <w:color w:val="F2CEED" w:themeColor="accent5" w:themeTint="33"/>
-        </w:rPr>
-        <w:t xml:space="preserve"> Trend</w:t>
-      </w:r>
+          <w:color w:val="00B0F0"/>
+        </w:rPr>
+      </w:pPr>
+      <w:r>
+        <w:rPr>
+          <w:color w:val="00B0F0"/>
+        </w:rPr>
+        <w:t xml:space="preserve">Content </w:t>
+      </w:r>
+      <w:proofErr w:type="spellStart"/>
+      <w:r>
+        <w:rPr>
+          <w:color w:val="00B0F0"/>
+        </w:rPr>
+        <w:t>structured</w:t>
+      </w:r>
+      <w:proofErr w:type="spellEnd"/>
+      <w:r>
+        <w:rPr>
+          <w:color w:val="00B0F0"/>
+        </w:rPr>
+        <w:t xml:space="preserve"> </w:t>
+      </w:r>
+      <w:proofErr w:type="spellStart"/>
+      <w:r>
+        <w:rPr>
+          <w:color w:val="00B0F0"/>
+        </w:rPr>
+        <w:t>as</w:t>
+      </w:r>
+      <w:proofErr w:type="spellEnd"/>
+      <w:r>
+        <w:rPr>
+          <w:color w:val="00B0F0"/>
+        </w:rPr>
+        <w:t xml:space="preserve"> a </w:t>
+      </w:r>
+      <w:proofErr w:type="spellStart"/>
+      <w:r>
+        <w:rPr>
+          <w:color w:val="00B0F0"/>
+        </w:rPr>
+        <w:t>question</w:t>
+      </w:r>
+      <w:proofErr w:type="spellEnd"/>
+      <w:r>
+        <w:rPr>
+          <w:color w:val="00B0F0"/>
+        </w:rPr>
+        <w:t xml:space="preserve"> </w:t>
+      </w:r>
+      <w:proofErr w:type="spellStart"/>
+      <w:r>
+        <w:rPr>
+          <w:color w:val="00B0F0"/>
+        </w:rPr>
+        <w:t>format</w:t>
+      </w:r>
+      <w:proofErr w:type="spellEnd"/>
+      <w:r>
+        <w:rPr>
+          <w:color w:val="00B0F0"/>
+        </w:rPr>
+        <w:t xml:space="preserve"> </w:t>
+      </w:r>
+      <w:r>
+        <w:rPr>
+          <w:color w:val="00B0F0"/>
+        </w:rPr>
+        <w:sym w:font="Wingdings" w:char="F0E0"/>
+      </w:r>
+      <w:r>
+        <w:rPr>
+          <w:color w:val="00B0F0"/>
+        </w:rPr>
+        <w:t xml:space="preserve"> </w:t>
+      </w:r>
+      <w:proofErr w:type="spellStart"/>
+      <w:r>
+        <w:rPr>
+          <w:color w:val="00B0F0"/>
+        </w:rPr>
+        <w:t>overview</w:t>
+      </w:r>
+      <w:proofErr w:type="spellEnd"/>
+      <w:r>
+        <w:rPr>
+          <w:color w:val="00B0F0"/>
+        </w:rPr>
+        <w:t xml:space="preserve"> </w:t>
+      </w:r>
+      <w:proofErr w:type="spellStart"/>
+      <w:r>
+        <w:rPr>
+          <w:color w:val="00B0F0"/>
+        </w:rPr>
+        <w:t>description</w:t>
+      </w:r>
+      <w:proofErr w:type="spellEnd"/>
+      <w:r>
+        <w:rPr>
+          <w:color w:val="00B0F0"/>
+        </w:rPr>
+        <w:t xml:space="preserve"> </w:t>
+      </w:r>
+      <w:proofErr w:type="spellStart"/>
+      <w:r>
+        <w:rPr>
+          <w:color w:val="00B0F0"/>
+        </w:rPr>
+        <w:t>with</w:t>
+      </w:r>
+      <w:proofErr w:type="spellEnd"/>
+      <w:r>
+        <w:rPr>
+          <w:color w:val="00B0F0"/>
+        </w:rPr>
+        <w:t xml:space="preserve"> </w:t>
+      </w:r>
+      <w:proofErr w:type="spellStart"/>
+      <w:r>
+        <w:rPr>
+          <w:color w:val="00B0F0"/>
+        </w:rPr>
+        <w:t>questions</w:t>
+      </w:r>
+      <w:proofErr w:type="spellEnd"/>
     </w:p>
     <w:p>
       <w:pPr>
@@ -1025,33 +1490,25 @@
           <w:ilvl w:val="0"/>
           <w:numId w:val="5"/>
         </w:numPr>
-      </w:pPr>
-      <w:r>
-        <w:rPr>
-          <w:color w:val="0F9ED5" w:themeColor="accent4"/>
-        </w:rPr>
-        <w:t xml:space="preserve">Home: 4-5 </w:t>
-      </w:r>
-      <w:proofErr w:type="spellStart"/>
-      <w:r>
-        <w:rPr>
-          <w:color w:val="0F9ED5" w:themeColor="accent4"/>
-        </w:rPr>
-        <w:t>business</w:t>
-      </w:r>
-      <w:proofErr w:type="spellEnd"/>
-      <w:r>
-        <w:rPr>
-          <w:color w:val="0F9ED5" w:themeColor="accent4"/>
-        </w:rPr>
-        <w:t xml:space="preserve"> </w:t>
-      </w:r>
-      <w:proofErr w:type="spellStart"/>
-      <w:r>
-        <w:rPr>
-          <w:color w:val="0F9ED5" w:themeColor="accent4"/>
-        </w:rPr>
-        <w:t>questions</w:t>
+        <w:rPr>
+          <w:strike/>
+          <w:color w:val="F2CEED" w:themeColor="accent5" w:themeTint="33"/>
+        </w:rPr>
+      </w:pPr>
+      <w:r>
+        <w:rPr>
+          <w:strike/>
+          <w:color w:val="F2CEED" w:themeColor="accent5" w:themeTint="33"/>
+        </w:rPr>
+        <w:t xml:space="preserve">«Dashboard» und «Swiss Hospital Data» </w:t>
+      </w:r>
+      <w:proofErr w:type="spellStart"/>
+      <w:r>
+        <w:rPr>
+          <w:strike/>
+          <w:color w:val="F2CEED" w:themeColor="accent5" w:themeTint="33"/>
+        </w:rPr>
+        <w:t>umbennenen</w:t>
       </w:r>
       <w:proofErr w:type="spellEnd"/>
     </w:p>
@@ -1063,580 +1520,433 @@
           <w:numId w:val="5"/>
         </w:numPr>
         <w:rPr>
-          <w:color w:val="0F9ED5" w:themeColor="accent4"/>
-        </w:rPr>
-      </w:pPr>
-      <w:r>
-        <w:rPr>
-          <w:color w:val="0F9ED5" w:themeColor="accent4"/>
-        </w:rPr>
-        <w:t xml:space="preserve">Summary </w:t>
-      </w:r>
-      <w:proofErr w:type="spellStart"/>
-      <w:r>
-        <w:rPr>
-          <w:color w:val="0F9ED5" w:themeColor="accent4"/>
+          <w:strike/>
+          <w:color w:val="F2CEED" w:themeColor="accent5" w:themeTint="33"/>
+        </w:rPr>
+      </w:pPr>
+      <w:r>
+        <w:rPr>
+          <w:strike/>
+          <w:color w:val="F2CEED" w:themeColor="accent5" w:themeTint="33"/>
+        </w:rPr>
+        <w:t xml:space="preserve">Farbe bei Gauge </w:t>
+      </w:r>
+      <w:proofErr w:type="spellStart"/>
+      <w:r>
+        <w:rPr>
+          <w:strike/>
+          <w:color w:val="F2CEED" w:themeColor="accent5" w:themeTint="33"/>
+        </w:rPr>
+        <w:t>Function</w:t>
+      </w:r>
+      <w:proofErr w:type="spellEnd"/>
+      <w:r>
+        <w:rPr>
+          <w:strike/>
+          <w:color w:val="F2CEED" w:themeColor="accent5" w:themeTint="33"/>
+        </w:rPr>
+        <w:t xml:space="preserve"> in Dashboard </w:t>
+      </w:r>
+      <w:r>
+        <w:rPr>
+          <w:strike/>
+          <w:color w:val="F2CEED" w:themeColor="accent5" w:themeTint="33"/>
+        </w:rPr>
+        <w:sym w:font="Wingdings" w:char="F0E0"/>
+      </w:r>
+      <w:r>
+        <w:rPr>
+          <w:strike/>
+          <w:color w:val="F2CEED" w:themeColor="accent5" w:themeTint="33"/>
+        </w:rPr>
+        <w:t xml:space="preserve"> </w:t>
+      </w:r>
+      <w:proofErr w:type="spellStart"/>
+      <w:r>
+        <w:rPr>
+          <w:strike/>
+          <w:color w:val="F2CEED" w:themeColor="accent5" w:themeTint="33"/>
+        </w:rPr>
+        <w:t>red</w:t>
+      </w:r>
+      <w:proofErr w:type="spellEnd"/>
+      <w:r>
+        <w:rPr>
+          <w:strike/>
+          <w:color w:val="F2CEED" w:themeColor="accent5" w:themeTint="33"/>
+        </w:rPr>
+        <w:t>!</w:t>
+      </w:r>
+    </w:p>
+    <w:p>
+      <w:pPr>
+        <w:pStyle w:val="Listenabsatz"/>
+        <w:numPr>
+          <w:ilvl w:val="0"/>
+          <w:numId w:val="5"/>
+        </w:numPr>
+        <w:rPr>
+          <w:strike/>
+          <w:color w:val="F2CEED" w:themeColor="accent5" w:themeTint="33"/>
+        </w:rPr>
+      </w:pPr>
+      <w:proofErr w:type="spellStart"/>
+      <w:r>
+        <w:rPr>
+          <w:strike/>
+          <w:color w:val="F2CEED" w:themeColor="accent5" w:themeTint="33"/>
+        </w:rPr>
+        <w:t>Dasboard</w:t>
+      </w:r>
+      <w:proofErr w:type="spellEnd"/>
+      <w:r>
+        <w:rPr>
+          <w:strike/>
+          <w:color w:val="F2CEED" w:themeColor="accent5" w:themeTint="33"/>
+        </w:rPr>
+        <w:t xml:space="preserve"> </w:t>
+      </w:r>
+      <w:r>
+        <w:rPr>
+          <w:strike/>
+          <w:color w:val="F2CEED" w:themeColor="accent5" w:themeTint="33"/>
+        </w:rPr>
+        <w:sym w:font="Wingdings" w:char="F0E0"/>
+      </w:r>
+      <w:r>
+        <w:rPr>
+          <w:strike/>
+          <w:color w:val="F2CEED" w:themeColor="accent5" w:themeTint="33"/>
+        </w:rPr>
+        <w:t xml:space="preserve"> </w:t>
+      </w:r>
+      <w:proofErr w:type="spellStart"/>
+      <w:r>
+        <w:rPr>
+          <w:strike/>
+          <w:color w:val="F2CEED" w:themeColor="accent5" w:themeTint="33"/>
+        </w:rPr>
+        <w:t>Percentage</w:t>
+      </w:r>
+      <w:proofErr w:type="spellEnd"/>
+      <w:r>
+        <w:rPr>
+          <w:strike/>
+          <w:color w:val="F2CEED" w:themeColor="accent5" w:themeTint="33"/>
+        </w:rPr>
+        <w:t xml:space="preserve"> </w:t>
+      </w:r>
+      <w:proofErr w:type="spellStart"/>
+      <w:r>
+        <w:rPr>
+          <w:strike/>
+          <w:color w:val="F2CEED" w:themeColor="accent5" w:themeTint="33"/>
+        </w:rPr>
+        <w:t>change</w:t>
+      </w:r>
+      <w:proofErr w:type="spellEnd"/>
+      <w:r>
+        <w:rPr>
+          <w:strike/>
+          <w:color w:val="F2CEED" w:themeColor="accent5" w:themeTint="33"/>
+        </w:rPr>
+        <w:t xml:space="preserve"> </w:t>
+      </w:r>
+      <w:proofErr w:type="spellStart"/>
+      <w:r>
+        <w:rPr>
+          <w:strike/>
+          <w:color w:val="F2CEED" w:themeColor="accent5" w:themeTint="33"/>
+        </w:rPr>
+        <w:t>descriptioin</w:t>
+      </w:r>
+      <w:proofErr w:type="spellEnd"/>
+      <w:r>
+        <w:rPr>
+          <w:strike/>
+          <w:color w:val="F2CEED" w:themeColor="accent5" w:themeTint="33"/>
+        </w:rPr>
+        <w:t xml:space="preserve"> </w:t>
+      </w:r>
+      <w:proofErr w:type="spellStart"/>
+      <w:r>
+        <w:rPr>
+          <w:strike/>
+          <w:color w:val="F2CEED" w:themeColor="accent5" w:themeTint="33"/>
+        </w:rPr>
+        <w:t>with</w:t>
+      </w:r>
+      <w:proofErr w:type="spellEnd"/>
+      <w:r>
+        <w:rPr>
+          <w:strike/>
+          <w:color w:val="F2CEED" w:themeColor="accent5" w:themeTint="33"/>
+        </w:rPr>
+        <w:t xml:space="preserve"> a </w:t>
+      </w:r>
+      <w:proofErr w:type="spellStart"/>
+      <w:r>
+        <w:rPr>
+          <w:strike/>
+          <w:color w:val="F2CEED" w:themeColor="accent5" w:themeTint="33"/>
+        </w:rPr>
+        <w:t>hover</w:t>
+      </w:r>
+      <w:proofErr w:type="spellEnd"/>
+      <w:r>
+        <w:rPr>
+          <w:strike/>
+          <w:color w:val="F2CEED" w:themeColor="accent5" w:themeTint="33"/>
+        </w:rPr>
+        <w:t xml:space="preserve"> </w:t>
+      </w:r>
+      <w:proofErr w:type="spellStart"/>
+      <w:r>
+        <w:rPr>
+          <w:strike/>
+          <w:color w:val="F2CEED" w:themeColor="accent5" w:themeTint="33"/>
+        </w:rPr>
+        <w:t>note</w:t>
+      </w:r>
+      <w:proofErr w:type="spellEnd"/>
+    </w:p>
+    <w:p>
+      <w:pPr>
+        <w:pStyle w:val="Listenabsatz"/>
+        <w:numPr>
+          <w:ilvl w:val="0"/>
+          <w:numId w:val="5"/>
+        </w:numPr>
+        <w:rPr>
+          <w:strike/>
+          <w:color w:val="F2CEED" w:themeColor="accent5" w:themeTint="33"/>
+        </w:rPr>
+      </w:pPr>
+      <w:proofErr w:type="spellStart"/>
+      <w:r>
+        <w:rPr>
+          <w:strike/>
+          <w:color w:val="F2CEED" w:themeColor="accent5" w:themeTint="33"/>
+        </w:rPr>
+        <w:t>Dasboard</w:t>
+      </w:r>
+      <w:proofErr w:type="spellEnd"/>
+      <w:r>
+        <w:rPr>
+          <w:strike/>
+          <w:color w:val="F2CEED" w:themeColor="accent5" w:themeTint="33"/>
+        </w:rPr>
+        <w:t xml:space="preserve"> </w:t>
+      </w:r>
+      <w:r>
+        <w:rPr>
+          <w:strike/>
+          <w:color w:val="F2CEED" w:themeColor="accent5" w:themeTint="33"/>
+        </w:rPr>
+        <w:sym w:font="Wingdings" w:char="F0E0"/>
+      </w:r>
+      <w:r>
+        <w:rPr>
+          <w:strike/>
+          <w:color w:val="F2CEED" w:themeColor="accent5" w:themeTint="33"/>
+        </w:rPr>
+        <w:t xml:space="preserve"> Line Chart </w:t>
+      </w:r>
+      <w:proofErr w:type="spellStart"/>
+      <w:r>
+        <w:rPr>
+          <w:strike/>
+          <w:color w:val="F2CEED" w:themeColor="accent5" w:themeTint="33"/>
+        </w:rPr>
+        <w:t>for</w:t>
+      </w:r>
+      <w:proofErr w:type="spellEnd"/>
+      <w:r>
+        <w:rPr>
+          <w:strike/>
+          <w:color w:val="F2CEED" w:themeColor="accent5" w:themeTint="33"/>
+        </w:rPr>
+        <w:t xml:space="preserve"> Average </w:t>
+      </w:r>
+      <w:proofErr w:type="spellStart"/>
+      <w:r>
+        <w:rPr>
+          <w:strike/>
+          <w:color w:val="F2CEED" w:themeColor="accent5" w:themeTint="33"/>
+        </w:rPr>
+        <w:t>Cost</w:t>
+      </w:r>
+      <w:proofErr w:type="spellEnd"/>
+    </w:p>
+    <w:p>
+      <w:pPr>
+        <w:pStyle w:val="Listenabsatz"/>
+        <w:numPr>
+          <w:ilvl w:val="0"/>
+          <w:numId w:val="5"/>
+        </w:numPr>
+        <w:rPr>
+          <w:strike/>
+          <w:color w:val="F2CEED" w:themeColor="accent5" w:themeTint="33"/>
+        </w:rPr>
+      </w:pPr>
+      <w:r>
+        <w:rPr>
+          <w:strike/>
+          <w:color w:val="F2CEED" w:themeColor="accent5" w:themeTint="33"/>
+        </w:rPr>
+        <w:t xml:space="preserve">Dashboard </w:t>
+      </w:r>
+      <w:r>
+        <w:rPr>
+          <w:strike/>
+          <w:color w:val="F2CEED" w:themeColor="accent5" w:themeTint="33"/>
+        </w:rPr>
+        <w:sym w:font="Wingdings" w:char="F0E0"/>
+      </w:r>
+      <w:r>
+        <w:rPr>
+          <w:strike/>
+          <w:color w:val="F2CEED" w:themeColor="accent5" w:themeTint="33"/>
+        </w:rPr>
+        <w:t xml:space="preserve"> </w:t>
+      </w:r>
+      <w:proofErr w:type="spellStart"/>
+      <w:r>
+        <w:rPr>
+          <w:strike/>
+          <w:color w:val="F2CEED" w:themeColor="accent5" w:themeTint="33"/>
+        </w:rPr>
+        <w:t>Bed</w:t>
+      </w:r>
+      <w:proofErr w:type="spellEnd"/>
+      <w:r>
+        <w:rPr>
+          <w:strike/>
+          <w:color w:val="F2CEED" w:themeColor="accent5" w:themeTint="33"/>
+        </w:rPr>
+        <w:t xml:space="preserve"> </w:t>
+      </w:r>
+      <w:proofErr w:type="spellStart"/>
+      <w:r>
+        <w:rPr>
+          <w:strike/>
+          <w:color w:val="F2CEED" w:themeColor="accent5" w:themeTint="33"/>
+        </w:rPr>
+        <w:t>Occupancy</w:t>
+      </w:r>
+      <w:proofErr w:type="spellEnd"/>
+      <w:r>
+        <w:rPr>
+          <w:strike/>
+          <w:color w:val="F2CEED" w:themeColor="accent5" w:themeTint="33"/>
+        </w:rPr>
+        <w:t>: Area Plot</w:t>
+      </w:r>
+    </w:p>
+    <w:p>
+      <w:pPr>
+        <w:pStyle w:val="Listenabsatz"/>
+        <w:numPr>
+          <w:ilvl w:val="0"/>
+          <w:numId w:val="5"/>
+        </w:numPr>
+        <w:rPr>
+          <w:strike/>
+          <w:color w:val="F2CEED" w:themeColor="accent5" w:themeTint="33"/>
+        </w:rPr>
+      </w:pPr>
+      <w:proofErr w:type="spellStart"/>
+      <w:r>
+        <w:rPr>
+          <w:strike/>
+          <w:color w:val="F2CEED" w:themeColor="accent5" w:themeTint="33"/>
+        </w:rPr>
+        <w:t>Dasboard</w:t>
+      </w:r>
+      <w:proofErr w:type="spellEnd"/>
+      <w:r>
+        <w:rPr>
+          <w:strike/>
+          <w:color w:val="F2CEED" w:themeColor="accent5" w:themeTint="33"/>
+        </w:rPr>
+        <w:t xml:space="preserve"> </w:t>
+      </w:r>
+      <w:r>
+        <w:rPr>
+          <w:strike/>
+          <w:color w:val="F2CEED" w:themeColor="accent5" w:themeTint="33"/>
+        </w:rPr>
+        <w:sym w:font="Wingdings" w:char="F0E0"/>
+      </w:r>
+      <w:r>
+        <w:rPr>
+          <w:strike/>
+          <w:color w:val="F2CEED" w:themeColor="accent5" w:themeTint="33"/>
+        </w:rPr>
+        <w:t xml:space="preserve"> Area Plots 2x2</w:t>
+      </w:r>
+    </w:p>
+    <w:p>
+      <w:pPr>
+        <w:pStyle w:val="Listenabsatz"/>
+        <w:numPr>
+          <w:ilvl w:val="0"/>
+          <w:numId w:val="5"/>
+        </w:numPr>
+        <w:rPr>
+          <w:strike/>
+          <w:color w:val="F2CEED" w:themeColor="accent5" w:themeTint="33"/>
+        </w:rPr>
+      </w:pPr>
+      <w:proofErr w:type="spellStart"/>
+      <w:r>
+        <w:rPr>
+          <w:strike/>
+          <w:color w:val="F2CEED" w:themeColor="accent5" w:themeTint="33"/>
+        </w:rPr>
+        <w:t>Smaller</w:t>
+      </w:r>
+      <w:proofErr w:type="spellEnd"/>
+      <w:r>
+        <w:rPr>
+          <w:strike/>
+          <w:color w:val="F2CEED" w:themeColor="accent5" w:themeTint="33"/>
+        </w:rPr>
+        <w:t xml:space="preserve"> Picture</w:t>
+      </w:r>
+    </w:p>
+    <w:p>
+      <w:pPr>
+        <w:pStyle w:val="Listenabsatz"/>
+        <w:numPr>
+          <w:ilvl w:val="0"/>
+          <w:numId w:val="5"/>
+        </w:numPr>
+        <w:rPr>
+          <w:strike/>
+          <w:color w:val="F2CEED" w:themeColor="accent5" w:themeTint="33"/>
+        </w:rPr>
+      </w:pPr>
+      <w:r>
+        <w:rPr>
+          <w:color w:val="F2CEED" w:themeColor="accent5" w:themeTint="33"/>
+        </w:rPr>
+        <w:t xml:space="preserve">Graph </w:t>
+      </w:r>
+      <w:proofErr w:type="spellStart"/>
+      <w:r>
+        <w:rPr>
+          <w:color w:val="F2CEED" w:themeColor="accent5" w:themeTint="33"/>
         </w:rPr>
         <w:t>of</w:t>
       </w:r>
       <w:proofErr w:type="spellEnd"/>
       <w:r>
         <w:rPr>
-          <w:color w:val="0F9ED5" w:themeColor="accent4"/>
-        </w:rPr>
-        <w:t xml:space="preserve"> </w:t>
-      </w:r>
-      <w:proofErr w:type="spellStart"/>
-      <w:r>
-        <w:rPr>
-          <w:color w:val="0F9ED5" w:themeColor="accent4"/>
-        </w:rPr>
-        <w:t>key</w:t>
-      </w:r>
-      <w:proofErr w:type="spellEnd"/>
-      <w:r>
-        <w:rPr>
-          <w:color w:val="0F9ED5" w:themeColor="accent4"/>
-        </w:rPr>
-        <w:t xml:space="preserve"> </w:t>
-      </w:r>
-      <w:proofErr w:type="spellStart"/>
-      <w:r>
-        <w:rPr>
-          <w:color w:val="0F9ED5" w:themeColor="accent4"/>
-        </w:rPr>
-        <w:t>visuals</w:t>
-      </w:r>
-      <w:proofErr w:type="spellEnd"/>
-      <w:r>
-        <w:rPr>
-          <w:color w:val="0F9ED5" w:themeColor="accent4"/>
-        </w:rPr>
-        <w:t xml:space="preserve"> and </w:t>
-      </w:r>
-      <w:proofErr w:type="spellStart"/>
-      <w:r>
-        <w:rPr>
-          <w:color w:val="0F9ED5" w:themeColor="accent4"/>
-        </w:rPr>
-        <w:t>take</w:t>
-      </w:r>
-      <w:proofErr w:type="spellEnd"/>
-      <w:r>
-        <w:rPr>
-          <w:color w:val="0F9ED5" w:themeColor="accent4"/>
-        </w:rPr>
-        <w:t xml:space="preserve"> </w:t>
-      </w:r>
-      <w:proofErr w:type="spellStart"/>
-      <w:r>
-        <w:rPr>
-          <w:color w:val="0F9ED5" w:themeColor="accent4"/>
-        </w:rPr>
-        <w:t>home</w:t>
-      </w:r>
-      <w:proofErr w:type="spellEnd"/>
-      <w:r>
-        <w:rPr>
-          <w:color w:val="0F9ED5" w:themeColor="accent4"/>
-        </w:rPr>
-        <w:t xml:space="preserve"> </w:t>
-      </w:r>
-      <w:proofErr w:type="spellStart"/>
-      <w:r>
-        <w:rPr>
-          <w:color w:val="0F9ED5" w:themeColor="accent4"/>
-        </w:rPr>
-        <w:t>messages</w:t>
-      </w:r>
-      <w:proofErr w:type="spellEnd"/>
-    </w:p>
-    <w:p>
-      <w:pPr>
-        <w:pStyle w:val="Listenabsatz"/>
-        <w:numPr>
-          <w:ilvl w:val="0"/>
-          <w:numId w:val="5"/>
-        </w:numPr>
-        <w:rPr>
-          <w:color w:val="0F9ED5" w:themeColor="accent4"/>
-        </w:rPr>
-      </w:pPr>
-      <w:r>
-        <w:rPr>
-          <w:color w:val="0F9ED5" w:themeColor="accent4"/>
-        </w:rPr>
-        <w:t xml:space="preserve">More explicit </w:t>
-      </w:r>
-      <w:proofErr w:type="spellStart"/>
-      <w:r>
-        <w:rPr>
-          <w:color w:val="0F9ED5" w:themeColor="accent4"/>
-        </w:rPr>
-        <w:t>description</w:t>
-      </w:r>
-      <w:proofErr w:type="spellEnd"/>
-      <w:r>
-        <w:rPr>
-          <w:color w:val="0F9ED5" w:themeColor="accent4"/>
-        </w:rPr>
-        <w:t xml:space="preserve"> on </w:t>
-      </w:r>
-      <w:proofErr w:type="spellStart"/>
-      <w:r>
-        <w:rPr>
-          <w:color w:val="0F9ED5" w:themeColor="accent4"/>
-        </w:rPr>
-        <w:t>our</w:t>
-      </w:r>
-      <w:proofErr w:type="spellEnd"/>
-      <w:r>
-        <w:rPr>
-          <w:color w:val="0F9ED5" w:themeColor="accent4"/>
-        </w:rPr>
-        <w:t xml:space="preserve"> </w:t>
-      </w:r>
-      <w:proofErr w:type="spellStart"/>
-      <w:r>
-        <w:rPr>
-          <w:color w:val="0F9ED5" w:themeColor="accent4"/>
-        </w:rPr>
-        <w:t>starting</w:t>
-      </w:r>
-      <w:proofErr w:type="spellEnd"/>
-      <w:r>
-        <w:rPr>
-          <w:color w:val="0F9ED5" w:themeColor="accent4"/>
-        </w:rPr>
-        <w:t xml:space="preserve"> </w:t>
-      </w:r>
-      <w:proofErr w:type="spellStart"/>
-      <w:r>
-        <w:rPr>
-          <w:color w:val="0F9ED5" w:themeColor="accent4"/>
-        </w:rPr>
-        <w:t>page</w:t>
-      </w:r>
-      <w:proofErr w:type="spellEnd"/>
-      <w:r>
-        <w:rPr>
-          <w:color w:val="0F9ED5" w:themeColor="accent4"/>
-        </w:rPr>
-        <w:t xml:space="preserve"> </w:t>
-      </w:r>
-      <w:r>
-        <w:rPr>
-          <w:color w:val="0F9ED5" w:themeColor="accent4"/>
-        </w:rPr>
-        <w:sym w:font="Wingdings" w:char="F0E0"/>
-      </w:r>
-      <w:r>
-        <w:rPr>
-          <w:color w:val="0F9ED5" w:themeColor="accent4"/>
-        </w:rPr>
-        <w:t xml:space="preserve"> «</w:t>
-      </w:r>
-      <w:proofErr w:type="spellStart"/>
-      <w:r>
-        <w:rPr>
-          <w:color w:val="0F9ED5" w:themeColor="accent4"/>
-        </w:rPr>
-        <w:t>s’chind</w:t>
-      </w:r>
-      <w:proofErr w:type="spellEnd"/>
-      <w:r>
-        <w:rPr>
-          <w:color w:val="0F9ED5" w:themeColor="accent4"/>
-        </w:rPr>
-        <w:t xml:space="preserve"> bim </w:t>
-      </w:r>
-      <w:proofErr w:type="spellStart"/>
-      <w:r>
-        <w:rPr>
-          <w:color w:val="0F9ED5" w:themeColor="accent4"/>
-        </w:rPr>
-        <w:t>name</w:t>
-      </w:r>
-      <w:proofErr w:type="spellEnd"/>
-      <w:r>
-        <w:rPr>
-          <w:color w:val="0F9ED5" w:themeColor="accent4"/>
-        </w:rPr>
-        <w:t xml:space="preserve"> nenne»</w:t>
-      </w:r>
-    </w:p>
-    <w:p>
-      <w:pPr>
-        <w:pStyle w:val="Listenabsatz"/>
-        <w:numPr>
-          <w:ilvl w:val="0"/>
-          <w:numId w:val="5"/>
-        </w:numPr>
-        <w:rPr>
-          <w:color w:val="00B0F0"/>
-        </w:rPr>
-      </w:pPr>
-      <w:r>
-        <w:rPr>
-          <w:color w:val="00B0F0"/>
-        </w:rPr>
-        <w:t xml:space="preserve">Content </w:t>
-      </w:r>
-      <w:proofErr w:type="spellStart"/>
-      <w:r>
-        <w:rPr>
-          <w:color w:val="00B0F0"/>
-        </w:rPr>
-        <w:t>structured</w:t>
-      </w:r>
-      <w:proofErr w:type="spellEnd"/>
-      <w:r>
-        <w:rPr>
-          <w:color w:val="00B0F0"/>
-        </w:rPr>
-        <w:t xml:space="preserve"> </w:t>
-      </w:r>
-      <w:proofErr w:type="spellStart"/>
-      <w:r>
-        <w:rPr>
-          <w:color w:val="00B0F0"/>
-        </w:rPr>
-        <w:t>as</w:t>
-      </w:r>
-      <w:proofErr w:type="spellEnd"/>
-      <w:r>
-        <w:rPr>
-          <w:color w:val="00B0F0"/>
-        </w:rPr>
-        <w:t xml:space="preserve"> a </w:t>
-      </w:r>
-      <w:proofErr w:type="spellStart"/>
-      <w:r>
-        <w:rPr>
-          <w:color w:val="00B0F0"/>
-        </w:rPr>
-        <w:t>question</w:t>
-      </w:r>
-      <w:proofErr w:type="spellEnd"/>
-      <w:r>
-        <w:rPr>
-          <w:color w:val="00B0F0"/>
-        </w:rPr>
-        <w:t xml:space="preserve"> </w:t>
-      </w:r>
-      <w:proofErr w:type="spellStart"/>
-      <w:r>
-        <w:rPr>
-          <w:color w:val="00B0F0"/>
-        </w:rPr>
-        <w:t>format</w:t>
-      </w:r>
-      <w:proofErr w:type="spellEnd"/>
-      <w:r>
-        <w:rPr>
-          <w:color w:val="00B0F0"/>
-        </w:rPr>
-        <w:t xml:space="preserve"> </w:t>
-      </w:r>
-      <w:r>
-        <w:rPr>
-          <w:color w:val="00B0F0"/>
-        </w:rPr>
-        <w:sym w:font="Wingdings" w:char="F0E0"/>
-      </w:r>
-      <w:r>
-        <w:rPr>
-          <w:color w:val="00B0F0"/>
-        </w:rPr>
-        <w:t xml:space="preserve"> </w:t>
-      </w:r>
-      <w:proofErr w:type="spellStart"/>
-      <w:r>
-        <w:rPr>
-          <w:color w:val="00B0F0"/>
-        </w:rPr>
-        <w:t>overview</w:t>
-      </w:r>
-      <w:proofErr w:type="spellEnd"/>
-      <w:r>
-        <w:rPr>
-          <w:color w:val="00B0F0"/>
-        </w:rPr>
-        <w:t xml:space="preserve"> </w:t>
-      </w:r>
-      <w:proofErr w:type="spellStart"/>
-      <w:r>
-        <w:rPr>
-          <w:color w:val="00B0F0"/>
-        </w:rPr>
-        <w:t>description</w:t>
-      </w:r>
-      <w:proofErr w:type="spellEnd"/>
-      <w:r>
-        <w:rPr>
-          <w:color w:val="00B0F0"/>
-        </w:rPr>
-        <w:t xml:space="preserve"> </w:t>
-      </w:r>
-      <w:proofErr w:type="spellStart"/>
-      <w:r>
-        <w:rPr>
-          <w:color w:val="00B0F0"/>
-        </w:rPr>
-        <w:t>with</w:t>
-      </w:r>
-      <w:proofErr w:type="spellEnd"/>
-      <w:r>
-        <w:rPr>
-          <w:color w:val="00B0F0"/>
-        </w:rPr>
-        <w:t xml:space="preserve"> </w:t>
-      </w:r>
-      <w:proofErr w:type="spellStart"/>
-      <w:r>
-        <w:rPr>
-          <w:color w:val="00B0F0"/>
-        </w:rPr>
-        <w:t>questions</w:t>
-      </w:r>
-      <w:proofErr w:type="spellEnd"/>
-    </w:p>
-    <w:p>
-      <w:pPr>
-        <w:pStyle w:val="Listenabsatz"/>
-        <w:numPr>
-          <w:ilvl w:val="0"/>
-          <w:numId w:val="5"/>
-        </w:numPr>
-        <w:rPr>
-          <w:color w:val="F2CEED" w:themeColor="accent5" w:themeTint="33"/>
-        </w:rPr>
-      </w:pPr>
-      <w:r>
-        <w:rPr>
-          <w:color w:val="F2CEED" w:themeColor="accent5" w:themeTint="33"/>
-        </w:rPr>
-        <w:t xml:space="preserve">«Dashboard» und «Swiss Hospital Data» </w:t>
-      </w:r>
-      <w:proofErr w:type="spellStart"/>
-      <w:r>
-        <w:rPr>
-          <w:color w:val="F2CEED" w:themeColor="accent5" w:themeTint="33"/>
-        </w:rPr>
-        <w:t>umbennenen</w:t>
-      </w:r>
-      <w:proofErr w:type="spellEnd"/>
-    </w:p>
-    <w:p>
-      <w:pPr>
-        <w:pStyle w:val="Listenabsatz"/>
-        <w:numPr>
-          <w:ilvl w:val="0"/>
-          <w:numId w:val="5"/>
-        </w:numPr>
-        <w:rPr>
-          <w:color w:val="F2CEED" w:themeColor="accent5" w:themeTint="33"/>
-        </w:rPr>
-      </w:pPr>
-      <w:r>
-        <w:rPr>
-          <w:color w:val="F2CEED" w:themeColor="accent5" w:themeTint="33"/>
-        </w:rPr>
-        <w:t xml:space="preserve">Farbe bei Gauge </w:t>
-      </w:r>
-      <w:proofErr w:type="spellStart"/>
-      <w:r>
-        <w:rPr>
-          <w:color w:val="F2CEED" w:themeColor="accent5" w:themeTint="33"/>
-        </w:rPr>
-        <w:t>Function</w:t>
-      </w:r>
-      <w:proofErr w:type="spellEnd"/>
-      <w:r>
-        <w:rPr>
-          <w:color w:val="F2CEED" w:themeColor="accent5" w:themeTint="33"/>
-        </w:rPr>
-        <w:t xml:space="preserve"> in Dashboard </w:t>
-      </w:r>
-      <w:r>
-        <w:rPr>
-          <w:color w:val="F2CEED" w:themeColor="accent5" w:themeTint="33"/>
-        </w:rPr>
-        <w:sym w:font="Wingdings" w:char="F0E0"/>
-      </w:r>
-      <w:r>
-        <w:rPr>
-          <w:color w:val="F2CEED" w:themeColor="accent5" w:themeTint="33"/>
-        </w:rPr>
-        <w:t xml:space="preserve"> </w:t>
-      </w:r>
-      <w:proofErr w:type="spellStart"/>
-      <w:r>
-        <w:rPr>
-          <w:color w:val="F2CEED" w:themeColor="accent5" w:themeTint="33"/>
-        </w:rPr>
-        <w:t>red</w:t>
-      </w:r>
-      <w:proofErr w:type="spellEnd"/>
-      <w:r>
-        <w:rPr>
-          <w:color w:val="F2CEED" w:themeColor="accent5" w:themeTint="33"/>
-        </w:rPr>
-        <w:t>!</w:t>
-      </w:r>
-    </w:p>
-    <w:p>
-      <w:pPr>
-        <w:pStyle w:val="Listenabsatz"/>
-        <w:numPr>
-          <w:ilvl w:val="0"/>
-          <w:numId w:val="5"/>
-        </w:numPr>
-        <w:rPr>
-          <w:color w:val="F2CEED" w:themeColor="accent5" w:themeTint="33"/>
-        </w:rPr>
-      </w:pPr>
-      <w:proofErr w:type="spellStart"/>
-      <w:r>
-        <w:rPr>
-          <w:color w:val="F2CEED" w:themeColor="accent5" w:themeTint="33"/>
-        </w:rPr>
-        <w:t>Dasboard</w:t>
-      </w:r>
-      <w:proofErr w:type="spellEnd"/>
-      <w:r>
-        <w:rPr>
-          <w:color w:val="F2CEED" w:themeColor="accent5" w:themeTint="33"/>
-        </w:rPr>
-        <w:t xml:space="preserve"> </w:t>
-      </w:r>
-      <w:r>
-        <w:rPr>
-          <w:color w:val="F2CEED" w:themeColor="accent5" w:themeTint="33"/>
-        </w:rPr>
-        <w:sym w:font="Wingdings" w:char="F0E0"/>
-      </w:r>
-      <w:r>
-        <w:rPr>
-          <w:color w:val="F2CEED" w:themeColor="accent5" w:themeTint="33"/>
-        </w:rPr>
-        <w:t xml:space="preserve"> </w:t>
-      </w:r>
-      <w:proofErr w:type="spellStart"/>
-      <w:r>
-        <w:rPr>
-          <w:color w:val="F2CEED" w:themeColor="accent5" w:themeTint="33"/>
-        </w:rPr>
-        <w:t>Percentage</w:t>
-      </w:r>
-      <w:proofErr w:type="spellEnd"/>
-      <w:r>
-        <w:rPr>
-          <w:color w:val="F2CEED" w:themeColor="accent5" w:themeTint="33"/>
-        </w:rPr>
-        <w:t xml:space="preserve"> </w:t>
-      </w:r>
-      <w:proofErr w:type="spellStart"/>
-      <w:r>
-        <w:rPr>
-          <w:color w:val="F2CEED" w:themeColor="accent5" w:themeTint="33"/>
-        </w:rPr>
-        <w:t>change</w:t>
-      </w:r>
-      <w:proofErr w:type="spellEnd"/>
-      <w:r>
-        <w:rPr>
-          <w:color w:val="F2CEED" w:themeColor="accent5" w:themeTint="33"/>
-        </w:rPr>
-        <w:t xml:space="preserve"> </w:t>
-      </w:r>
-      <w:proofErr w:type="spellStart"/>
-      <w:r>
-        <w:rPr>
-          <w:color w:val="F2CEED" w:themeColor="accent5" w:themeTint="33"/>
-        </w:rPr>
-        <w:t>descriptioin</w:t>
-      </w:r>
-      <w:proofErr w:type="spellEnd"/>
-      <w:r>
-        <w:rPr>
-          <w:color w:val="F2CEED" w:themeColor="accent5" w:themeTint="33"/>
-        </w:rPr>
-        <w:t xml:space="preserve"> </w:t>
-      </w:r>
-      <w:proofErr w:type="spellStart"/>
-      <w:r>
-        <w:rPr>
-          <w:color w:val="F2CEED" w:themeColor="accent5" w:themeTint="33"/>
-        </w:rPr>
-        <w:t>with</w:t>
-      </w:r>
-      <w:proofErr w:type="spellEnd"/>
-      <w:r>
-        <w:rPr>
-          <w:color w:val="F2CEED" w:themeColor="accent5" w:themeTint="33"/>
-        </w:rPr>
-        <w:t xml:space="preserve"> a </w:t>
-      </w:r>
-      <w:proofErr w:type="spellStart"/>
-      <w:r>
-        <w:rPr>
-          <w:color w:val="F2CEED" w:themeColor="accent5" w:themeTint="33"/>
-        </w:rPr>
-        <w:t>hover</w:t>
-      </w:r>
-      <w:proofErr w:type="spellEnd"/>
-      <w:r>
-        <w:rPr>
-          <w:color w:val="F2CEED" w:themeColor="accent5" w:themeTint="33"/>
-        </w:rPr>
-        <w:t xml:space="preserve"> </w:t>
-      </w:r>
-      <w:proofErr w:type="spellStart"/>
-      <w:r>
-        <w:rPr>
-          <w:color w:val="F2CEED" w:themeColor="accent5" w:themeTint="33"/>
-        </w:rPr>
-        <w:t>note</w:t>
-      </w:r>
-      <w:proofErr w:type="spellEnd"/>
-    </w:p>
-    <w:p>
-      <w:pPr>
-        <w:pStyle w:val="Listenabsatz"/>
-        <w:numPr>
-          <w:ilvl w:val="0"/>
-          <w:numId w:val="5"/>
-        </w:numPr>
-        <w:rPr>
-          <w:color w:val="F2CEED" w:themeColor="accent5" w:themeTint="33"/>
-        </w:rPr>
-      </w:pPr>
-      <w:proofErr w:type="spellStart"/>
-      <w:r>
-        <w:rPr>
-          <w:color w:val="F2CEED" w:themeColor="accent5" w:themeTint="33"/>
-        </w:rPr>
-        <w:t>Dasboard</w:t>
-      </w:r>
-      <w:proofErr w:type="spellEnd"/>
-      <w:r>
-        <w:rPr>
-          <w:color w:val="F2CEED" w:themeColor="accent5" w:themeTint="33"/>
-        </w:rPr>
-        <w:t xml:space="preserve"> </w:t>
-      </w:r>
-      <w:r>
-        <w:rPr>
-          <w:color w:val="F2CEED" w:themeColor="accent5" w:themeTint="33"/>
-        </w:rPr>
-        <w:sym w:font="Wingdings" w:char="F0E0"/>
-      </w:r>
-      <w:r>
-        <w:rPr>
-          <w:color w:val="F2CEED" w:themeColor="accent5" w:themeTint="33"/>
-        </w:rPr>
-        <w:t xml:space="preserve"> Line Chart </w:t>
+          <w:color w:val="F2CEED" w:themeColor="accent5" w:themeTint="33"/>
+        </w:rPr>
+        <w:t xml:space="preserve"> Emotions </w:t>
       </w:r>
       <w:proofErr w:type="spellStart"/>
       <w:r>
@@ -1650,138 +1960,16 @@
         <w:rPr>
           <w:color w:val="F2CEED" w:themeColor="accent5" w:themeTint="33"/>
         </w:rPr>
-        <w:t xml:space="preserve"> Average </w:t>
-      </w:r>
-      <w:proofErr w:type="spellStart"/>
-      <w:r>
-        <w:rPr>
-          <w:color w:val="F2CEED" w:themeColor="accent5" w:themeTint="33"/>
-        </w:rPr>
-        <w:t>Cost</w:t>
-      </w:r>
-      <w:proofErr w:type="spellEnd"/>
-    </w:p>
-    <w:p>
-      <w:pPr>
-        <w:pStyle w:val="Listenabsatz"/>
-        <w:numPr>
-          <w:ilvl w:val="0"/>
-          <w:numId w:val="5"/>
-        </w:numPr>
-        <w:rPr>
-          <w:color w:val="F2CEED" w:themeColor="accent5" w:themeTint="33"/>
-        </w:rPr>
-      </w:pPr>
-      <w:r>
-        <w:rPr>
-          <w:color w:val="F2CEED" w:themeColor="accent5" w:themeTint="33"/>
-        </w:rPr>
-        <w:t xml:space="preserve">Dashboard </w:t>
-      </w:r>
-      <w:r>
-        <w:rPr>
-          <w:color w:val="F2CEED" w:themeColor="accent5" w:themeTint="33"/>
-        </w:rPr>
-        <w:sym w:font="Wingdings" w:char="F0E0"/>
-      </w:r>
-      <w:r>
-        <w:rPr>
-          <w:color w:val="F2CEED" w:themeColor="accent5" w:themeTint="33"/>
-        </w:rPr>
-        <w:t xml:space="preserve"> </w:t>
-      </w:r>
-      <w:proofErr w:type="spellStart"/>
-      <w:r>
-        <w:rPr>
-          <w:color w:val="F2CEED" w:themeColor="accent5" w:themeTint="33"/>
-        </w:rPr>
-        <w:t>Bed</w:t>
-      </w:r>
-      <w:proofErr w:type="spellEnd"/>
-      <w:r>
-        <w:rPr>
-          <w:color w:val="F2CEED" w:themeColor="accent5" w:themeTint="33"/>
-        </w:rPr>
-        <w:t xml:space="preserve"> </w:t>
-      </w:r>
-      <w:proofErr w:type="spellStart"/>
-      <w:r>
-        <w:rPr>
-          <w:color w:val="F2CEED" w:themeColor="accent5" w:themeTint="33"/>
-        </w:rPr>
-        <w:t>Occupancy</w:t>
-      </w:r>
-      <w:proofErr w:type="spellEnd"/>
-      <w:r>
-        <w:rPr>
-          <w:color w:val="F2CEED" w:themeColor="accent5" w:themeTint="33"/>
-        </w:rPr>
-        <w:t>: Area Plot</w:t>
-      </w:r>
-    </w:p>
-    <w:p>
-      <w:pPr>
-        <w:pStyle w:val="Listenabsatz"/>
-        <w:numPr>
-          <w:ilvl w:val="0"/>
-          <w:numId w:val="5"/>
-        </w:numPr>
-        <w:rPr>
-          <w:color w:val="F2CEED" w:themeColor="accent5" w:themeTint="33"/>
-        </w:rPr>
-      </w:pPr>
-      <w:proofErr w:type="spellStart"/>
-      <w:r>
-        <w:rPr>
-          <w:color w:val="F2CEED" w:themeColor="accent5" w:themeTint="33"/>
-        </w:rPr>
-        <w:t>Dasboard</w:t>
-      </w:r>
-      <w:proofErr w:type="spellEnd"/>
-      <w:r>
-        <w:rPr>
-          <w:color w:val="F2CEED" w:themeColor="accent5" w:themeTint="33"/>
-        </w:rPr>
-        <w:t xml:space="preserve"> </w:t>
-      </w:r>
-      <w:r>
-        <w:rPr>
-          <w:color w:val="F2CEED" w:themeColor="accent5" w:themeTint="33"/>
-        </w:rPr>
-        <w:sym w:font="Wingdings" w:char="F0E0"/>
-      </w:r>
-      <w:r>
-        <w:rPr>
-          <w:color w:val="F2CEED" w:themeColor="accent5" w:themeTint="33"/>
-        </w:rPr>
-        <w:t xml:space="preserve"> Area Plots 2x2</w:t>
-      </w:r>
-    </w:p>
-    <w:p>
-      <w:pPr>
-        <w:pStyle w:val="Listenabsatz"/>
-        <w:numPr>
-          <w:ilvl w:val="0"/>
-          <w:numId w:val="5"/>
-        </w:numPr>
-        <w:rPr>
-          <w:color w:val="F2CEED" w:themeColor="accent5" w:themeTint="33"/>
-        </w:rPr>
-      </w:pPr>
-      <w:proofErr w:type="spellStart"/>
-      <w:r>
-        <w:rPr>
-          <w:color w:val="F2CEED" w:themeColor="accent5" w:themeTint="33"/>
-        </w:rPr>
-        <w:t>Smaller</w:t>
-      </w:r>
-      <w:proofErr w:type="spellEnd"/>
-      <w:r>
-        <w:rPr>
-          <w:color w:val="F2CEED" w:themeColor="accent5" w:themeTint="33"/>
-        </w:rPr>
-        <w:t xml:space="preserve"> Picture</w:t>
-      </w:r>
+        <w:t xml:space="preserve"> </w:t>
+      </w:r>
+      <w:proofErr w:type="spellStart"/>
+      <w:r>
+        <w:rPr>
+          <w:color w:val="F2CEED" w:themeColor="accent5" w:themeTint="33"/>
+        </w:rPr>
+        <w:t>Presentation</w:t>
+      </w:r>
+      <w:proofErr w:type="spellEnd"/>
     </w:p>
     <w:p/>
     <w:p>
@@ -2489,6 +2677,7 @@
       </w:pPr>
       <w:proofErr w:type="spellStart"/>
       <w:r>
+        <w:lastRenderedPageBreak/>
         <w:t>Legère</w:t>
       </w:r>
       <w:proofErr w:type="spellEnd"/>
@@ -2516,7 +2705,6 @@
         </w:numPr>
       </w:pPr>
       <w:r>
-        <w:lastRenderedPageBreak/>
         <w:t xml:space="preserve"> Dashboard – </w:t>
       </w:r>
       <w:proofErr w:type="spellStart"/>

</xml_diff>

<commit_message>
ridying up the whole webapp and make everythin clean
</commit_message>
<xml_diff>
--- a/schedule/open_todos_06.11.docx
+++ b/schedule/open_todos_06.11.docx
@@ -864,12 +864,14 @@
           <w:numId w:val="5"/>
         </w:numPr>
         <w:rPr>
+          <w:strike/>
           <w:color w:val="D86DCB" w:themeColor="accent5" w:themeTint="99"/>
         </w:rPr>
       </w:pPr>
       <w:proofErr w:type="spellStart"/>
       <w:r>
         <w:rPr>
+          <w:strike/>
           <w:color w:val="D86DCB" w:themeColor="accent5" w:themeTint="99"/>
         </w:rPr>
         <w:t>Regressions</w:t>
@@ -877,6 +879,7 @@
       <w:proofErr w:type="spellEnd"/>
       <w:r>
         <w:rPr>
+          <w:strike/>
           <w:color w:val="D86DCB" w:themeColor="accent5" w:themeTint="99"/>
         </w:rPr>
         <w:t xml:space="preserve">: Beschreibung: Nur Korrelation, Zusammenhang, Wie kann </w:t>
@@ -884,6 +887,7 @@
       <w:proofErr w:type="spellStart"/>
       <w:r>
         <w:rPr>
+          <w:strike/>
           <w:color w:val="D86DCB" w:themeColor="accent5" w:themeTint="99"/>
         </w:rPr>
         <w:t>Slope</w:t>
@@ -891,24 +895,28 @@
       <w:proofErr w:type="spellEnd"/>
       <w:r>
         <w:rPr>
+          <w:strike/>
           <w:color w:val="D86DCB" w:themeColor="accent5" w:themeTint="99"/>
         </w:rPr>
         <w:t xml:space="preserve"> interpretiert werden, Wieso? Was wurde gemacht? FE &amp; Ausreisser entfernt teilweise</w:t>
       </w:r>
       <w:r>
         <w:rPr>
+          <w:strike/>
           <w:color w:val="D86DCB" w:themeColor="accent5" w:themeTint="99"/>
         </w:rPr>
         <w:t xml:space="preserve"> </w:t>
       </w:r>
       <w:r>
         <w:rPr>
+          <w:strike/>
           <w:color w:val="D86DCB" w:themeColor="accent5" w:themeTint="99"/>
         </w:rPr>
         <w:sym w:font="Wingdings" w:char="F0E0"/>
       </w:r>
       <w:r>
         <w:rPr>
+          <w:strike/>
           <w:color w:val="D86DCB" w:themeColor="accent5" w:themeTint="99"/>
         </w:rPr>
         <w:t xml:space="preserve"> morgen</w:t>
@@ -922,11 +930,13 @@
           <w:numId w:val="5"/>
         </w:numPr>
         <w:rPr>
-          <w:color w:val="F2CEED" w:themeColor="accent5" w:themeTint="33"/>
-        </w:rPr>
-      </w:pPr>
-      <w:r>
-        <w:rPr>
+          <w:strike/>
+          <w:color w:val="F2CEED" w:themeColor="accent5" w:themeTint="33"/>
+        </w:rPr>
+      </w:pPr>
+      <w:r>
+        <w:rPr>
+          <w:strike/>
           <w:color w:val="F2CEED" w:themeColor="accent5" w:themeTint="33"/>
         </w:rPr>
         <w:t xml:space="preserve">Beim Datensatz noch </w:t>
@@ -934,6 +944,7 @@
       <w:proofErr w:type="spellStart"/>
       <w:r>
         <w:rPr>
+          <w:strike/>
           <w:color w:val="F2CEED" w:themeColor="accent5" w:themeTint="33"/>
         </w:rPr>
         <w:t>none</w:t>
@@ -941,24 +952,28 @@
       <w:proofErr w:type="spellEnd"/>
       <w:r>
         <w:rPr>
+          <w:strike/>
           <w:color w:val="F2CEED" w:themeColor="accent5" w:themeTint="33"/>
         </w:rPr>
         <w:t xml:space="preserve"> durch X ersetzen?</w:t>
       </w:r>
       <w:r>
         <w:rPr>
-          <w:color w:val="F2CEED" w:themeColor="accent5" w:themeTint="33"/>
-        </w:rPr>
-        <w:t xml:space="preserve"> </w:t>
-      </w:r>
-      <w:r>
-        <w:rPr>
+          <w:strike/>
+          <w:color w:val="F2CEED" w:themeColor="accent5" w:themeTint="33"/>
+        </w:rPr>
+        <w:t xml:space="preserve"> </w:t>
+      </w:r>
+      <w:r>
+        <w:rPr>
+          <w:strike/>
           <w:color w:val="F2CEED" w:themeColor="accent5" w:themeTint="33"/>
         </w:rPr>
         <w:sym w:font="Wingdings" w:char="F0E0"/>
       </w:r>
       <w:r>
         <w:rPr>
+          <w:strike/>
           <w:color w:val="F2CEED" w:themeColor="accent5" w:themeTint="33"/>
         </w:rPr>
         <w:t xml:space="preserve"> morgen</w:t>
@@ -972,29 +987,34 @@
           <w:numId w:val="5"/>
         </w:numPr>
         <w:rPr>
-          <w:color w:val="F2CEED" w:themeColor="accent5" w:themeTint="33"/>
-        </w:rPr>
-      </w:pPr>
-      <w:r>
-        <w:rPr>
+          <w:strike/>
+          <w:color w:val="F2CEED" w:themeColor="accent5" w:themeTint="33"/>
+        </w:rPr>
+      </w:pPr>
+      <w:r>
+        <w:rPr>
+          <w:strike/>
           <w:color w:val="F2CEED" w:themeColor="accent5" w:themeTint="33"/>
         </w:rPr>
         <w:t>Zeichnung und Bild rein</w:t>
       </w:r>
       <w:r>
         <w:rPr>
-          <w:color w:val="F2CEED" w:themeColor="accent5" w:themeTint="33"/>
-        </w:rPr>
-        <w:t xml:space="preserve"> </w:t>
-      </w:r>
-      <w:r>
-        <w:rPr>
+          <w:strike/>
+          <w:color w:val="F2CEED" w:themeColor="accent5" w:themeTint="33"/>
+        </w:rPr>
+        <w:t xml:space="preserve"> </w:t>
+      </w:r>
+      <w:r>
+        <w:rPr>
+          <w:strike/>
           <w:color w:val="F2CEED" w:themeColor="accent5" w:themeTint="33"/>
         </w:rPr>
         <w:sym w:font="Wingdings" w:char="F0E0"/>
       </w:r>
       <w:r>
         <w:rPr>
+          <w:strike/>
           <w:color w:val="F2CEED" w:themeColor="accent5" w:themeTint="33"/>
         </w:rPr>
         <w:t xml:space="preserve"> morgen</w:t>
@@ -1019,12 +1039,14 @@
       </w:r>
       <w:r>
         <w:rPr>
+          <w:strike/>
           <w:color w:val="D86DCB" w:themeColor="accent5" w:themeTint="99"/>
         </w:rPr>
         <w:t>Konfidenzintervall bei Regressionen</w:t>
       </w:r>
       <w:r>
         <w:rPr>
+          <w:strike/>
           <w:color w:val="D86DCB" w:themeColor="accent5" w:themeTint="99"/>
         </w:rPr>
         <w:t>)</w:t>
@@ -1107,9 +1129,13 @@
           <w:ilvl w:val="0"/>
           <w:numId w:val="5"/>
         </w:numPr>
-      </w:pPr>
-      <w:r>
-        <w:rPr>
+        <w:rPr>
+          <w:strike/>
+        </w:rPr>
+      </w:pPr>
+      <w:r>
+        <w:rPr>
+          <w:strike/>
           <w:color w:val="0F9ED5" w:themeColor="accent4"/>
         </w:rPr>
         <w:t xml:space="preserve">Home: 4-5 </w:t>
@@ -1117,6 +1143,7 @@
       <w:proofErr w:type="spellStart"/>
       <w:r>
         <w:rPr>
+          <w:strike/>
           <w:color w:val="0F9ED5" w:themeColor="accent4"/>
         </w:rPr>
         <w:t>business</w:t>
@@ -1124,6 +1151,7 @@
       <w:proofErr w:type="spellEnd"/>
       <w:r>
         <w:rPr>
+          <w:strike/>
           <w:color w:val="0F9ED5" w:themeColor="accent4"/>
         </w:rPr>
         <w:t xml:space="preserve"> </w:t>
@@ -1131,6 +1159,7 @@
       <w:proofErr w:type="spellStart"/>
       <w:r>
         <w:rPr>
+          <w:strike/>
           <w:color w:val="0F9ED5" w:themeColor="accent4"/>
         </w:rPr>
         <w:t>questions</w:t>
@@ -1145,11 +1174,13 @@
           <w:numId w:val="5"/>
         </w:numPr>
         <w:rPr>
+          <w:strike/>
           <w:color w:val="0F9ED5" w:themeColor="accent4"/>
         </w:rPr>
       </w:pPr>
       <w:r>
         <w:rPr>
+          <w:strike/>
           <w:color w:val="0F9ED5" w:themeColor="accent4"/>
         </w:rPr>
         <w:t xml:space="preserve">Summary </w:t>
@@ -1157,6 +1188,7 @@
       <w:proofErr w:type="spellStart"/>
       <w:r>
         <w:rPr>
+          <w:strike/>
           <w:color w:val="0F9ED5" w:themeColor="accent4"/>
         </w:rPr>
         <w:t>of</w:t>
@@ -1164,6 +1196,7 @@
       <w:proofErr w:type="spellEnd"/>
       <w:r>
         <w:rPr>
+          <w:strike/>
           <w:color w:val="0F9ED5" w:themeColor="accent4"/>
         </w:rPr>
         <w:t xml:space="preserve"> </w:t>
@@ -1171,6 +1204,7 @@
       <w:proofErr w:type="spellStart"/>
       <w:r>
         <w:rPr>
+          <w:strike/>
           <w:color w:val="0F9ED5" w:themeColor="accent4"/>
         </w:rPr>
         <w:t>key</w:t>
@@ -1178,6 +1212,7 @@
       <w:proofErr w:type="spellEnd"/>
       <w:r>
         <w:rPr>
+          <w:strike/>
           <w:color w:val="0F9ED5" w:themeColor="accent4"/>
         </w:rPr>
         <w:t xml:space="preserve"> </w:t>
@@ -1185,6 +1220,7 @@
       <w:proofErr w:type="spellStart"/>
       <w:r>
         <w:rPr>
+          <w:strike/>
           <w:color w:val="0F9ED5" w:themeColor="accent4"/>
         </w:rPr>
         <w:t>visuals</w:t>
@@ -1192,6 +1228,7 @@
       <w:proofErr w:type="spellEnd"/>
       <w:r>
         <w:rPr>
+          <w:strike/>
           <w:color w:val="0F9ED5" w:themeColor="accent4"/>
         </w:rPr>
         <w:t xml:space="preserve"> and </w:t>
@@ -1199,6 +1236,7 @@
       <w:proofErr w:type="spellStart"/>
       <w:r>
         <w:rPr>
+          <w:strike/>
           <w:color w:val="0F9ED5" w:themeColor="accent4"/>
         </w:rPr>
         <w:t>take</w:t>
@@ -1206,6 +1244,7 @@
       <w:proofErr w:type="spellEnd"/>
       <w:r>
         <w:rPr>
+          <w:strike/>
           <w:color w:val="0F9ED5" w:themeColor="accent4"/>
         </w:rPr>
         <w:t xml:space="preserve"> </w:t>
@@ -1213,6 +1252,7 @@
       <w:proofErr w:type="spellStart"/>
       <w:r>
         <w:rPr>
+          <w:strike/>
           <w:color w:val="0F9ED5" w:themeColor="accent4"/>
         </w:rPr>
         <w:t>home</w:t>
@@ -1220,6 +1260,7 @@
       <w:proofErr w:type="spellEnd"/>
       <w:r>
         <w:rPr>
+          <w:strike/>
           <w:color w:val="0F9ED5" w:themeColor="accent4"/>
         </w:rPr>
         <w:t xml:space="preserve"> </w:t>
@@ -1227,6 +1268,7 @@
       <w:proofErr w:type="spellStart"/>
       <w:r>
         <w:rPr>
+          <w:strike/>
           <w:color w:val="0F9ED5" w:themeColor="accent4"/>
         </w:rPr>
         <w:t>messages</w:t>
@@ -1241,11 +1283,13 @@
           <w:numId w:val="5"/>
         </w:numPr>
         <w:rPr>
+          <w:strike/>
           <w:color w:val="0F9ED5" w:themeColor="accent4"/>
         </w:rPr>
       </w:pPr>
       <w:r>
         <w:rPr>
+          <w:strike/>
           <w:color w:val="0F9ED5" w:themeColor="accent4"/>
         </w:rPr>
         <w:t xml:space="preserve">More explicit </w:t>
@@ -1253,6 +1297,7 @@
       <w:proofErr w:type="spellStart"/>
       <w:r>
         <w:rPr>
+          <w:strike/>
           <w:color w:val="0F9ED5" w:themeColor="accent4"/>
         </w:rPr>
         <w:t>description</w:t>
@@ -1260,6 +1305,7 @@
       <w:proofErr w:type="spellEnd"/>
       <w:r>
         <w:rPr>
+          <w:strike/>
           <w:color w:val="0F9ED5" w:themeColor="accent4"/>
         </w:rPr>
         <w:t xml:space="preserve"> on </w:t>
@@ -1267,6 +1313,7 @@
       <w:proofErr w:type="spellStart"/>
       <w:r>
         <w:rPr>
+          <w:strike/>
           <w:color w:val="0F9ED5" w:themeColor="accent4"/>
         </w:rPr>
         <w:t>our</w:t>
@@ -1274,6 +1321,7 @@
       <w:proofErr w:type="spellEnd"/>
       <w:r>
         <w:rPr>
+          <w:strike/>
           <w:color w:val="0F9ED5" w:themeColor="accent4"/>
         </w:rPr>
         <w:t xml:space="preserve"> </w:t>
@@ -1281,6 +1329,7 @@
       <w:proofErr w:type="spellStart"/>
       <w:r>
         <w:rPr>
+          <w:strike/>
           <w:color w:val="0F9ED5" w:themeColor="accent4"/>
         </w:rPr>
         <w:t>starting</w:t>
@@ -1288,6 +1337,7 @@
       <w:proofErr w:type="spellEnd"/>
       <w:r>
         <w:rPr>
+          <w:strike/>
           <w:color w:val="0F9ED5" w:themeColor="accent4"/>
         </w:rPr>
         <w:t xml:space="preserve"> </w:t>
@@ -1295,6 +1345,7 @@
       <w:proofErr w:type="spellStart"/>
       <w:r>
         <w:rPr>
+          <w:strike/>
           <w:color w:val="0F9ED5" w:themeColor="accent4"/>
         </w:rPr>
         <w:t>page</w:t>
@@ -1302,18 +1353,21 @@
       <w:proofErr w:type="spellEnd"/>
       <w:r>
         <w:rPr>
+          <w:strike/>
           <w:color w:val="0F9ED5" w:themeColor="accent4"/>
         </w:rPr>
         <w:t xml:space="preserve"> </w:t>
       </w:r>
       <w:r>
         <w:rPr>
+          <w:strike/>
           <w:color w:val="0F9ED5" w:themeColor="accent4"/>
         </w:rPr>
         <w:sym w:font="Wingdings" w:char="F0E0"/>
       </w:r>
       <w:r>
         <w:rPr>
+          <w:strike/>
           <w:color w:val="0F9ED5" w:themeColor="accent4"/>
         </w:rPr>
         <w:t xml:space="preserve"> «</w:t>
@@ -1321,6 +1375,7 @@
       <w:proofErr w:type="spellStart"/>
       <w:r>
         <w:rPr>
+          <w:strike/>
           <w:color w:val="0F9ED5" w:themeColor="accent4"/>
         </w:rPr>
         <w:t>s’chind</w:t>
@@ -1328,6 +1383,7 @@
       <w:proofErr w:type="spellEnd"/>
       <w:r>
         <w:rPr>
+          <w:strike/>
           <w:color w:val="0F9ED5" w:themeColor="accent4"/>
         </w:rPr>
         <w:t xml:space="preserve"> bim </w:t>
@@ -1335,6 +1391,7 @@
       <w:proofErr w:type="spellStart"/>
       <w:r>
         <w:rPr>
+          <w:strike/>
           <w:color w:val="0F9ED5" w:themeColor="accent4"/>
         </w:rPr>
         <w:t>name</w:t>
@@ -1342,6 +1399,7 @@
       <w:proofErr w:type="spellEnd"/>
       <w:r>
         <w:rPr>
+          <w:strike/>
           <w:color w:val="0F9ED5" w:themeColor="accent4"/>
         </w:rPr>
         <w:t xml:space="preserve"> nenne»</w:t>
@@ -1355,11 +1413,13 @@
           <w:numId w:val="5"/>
         </w:numPr>
         <w:rPr>
+          <w:strike/>
           <w:color w:val="00B0F0"/>
         </w:rPr>
       </w:pPr>
       <w:r>
         <w:rPr>
+          <w:strike/>
           <w:color w:val="00B0F0"/>
         </w:rPr>
         <w:t xml:space="preserve">Content </w:t>
@@ -1367,6 +1427,7 @@
       <w:proofErr w:type="spellStart"/>
       <w:r>
         <w:rPr>
+          <w:strike/>
           <w:color w:val="00B0F0"/>
         </w:rPr>
         <w:t>structured</w:t>
@@ -1374,6 +1435,7 @@
       <w:proofErr w:type="spellEnd"/>
       <w:r>
         <w:rPr>
+          <w:strike/>
           <w:color w:val="00B0F0"/>
         </w:rPr>
         <w:t xml:space="preserve"> </w:t>
@@ -1381,6 +1443,7 @@
       <w:proofErr w:type="spellStart"/>
       <w:r>
         <w:rPr>
+          <w:strike/>
           <w:color w:val="00B0F0"/>
         </w:rPr>
         <w:t>as</w:t>
@@ -1388,6 +1451,7 @@
       <w:proofErr w:type="spellEnd"/>
       <w:r>
         <w:rPr>
+          <w:strike/>
           <w:color w:val="00B0F0"/>
         </w:rPr>
         <w:t xml:space="preserve"> a </w:t>
@@ -1395,6 +1459,7 @@
       <w:proofErr w:type="spellStart"/>
       <w:r>
         <w:rPr>
+          <w:strike/>
           <w:color w:val="00B0F0"/>
         </w:rPr>
         <w:t>question</w:t>
@@ -1402,6 +1467,7 @@
       <w:proofErr w:type="spellEnd"/>
       <w:r>
         <w:rPr>
+          <w:strike/>
           <w:color w:val="00B0F0"/>
         </w:rPr>
         <w:t xml:space="preserve"> </w:t>
@@ -1409,6 +1475,7 @@
       <w:proofErr w:type="spellStart"/>
       <w:r>
         <w:rPr>
+          <w:strike/>
           <w:color w:val="00B0F0"/>
         </w:rPr>
         <w:t>format</w:t>
@@ -1416,18 +1483,21 @@
       <w:proofErr w:type="spellEnd"/>
       <w:r>
         <w:rPr>
+          <w:strike/>
           <w:color w:val="00B0F0"/>
         </w:rPr>
         <w:t xml:space="preserve"> </w:t>
       </w:r>
       <w:r>
         <w:rPr>
+          <w:strike/>
           <w:color w:val="00B0F0"/>
         </w:rPr>
         <w:sym w:font="Wingdings" w:char="F0E0"/>
       </w:r>
       <w:r>
         <w:rPr>
+          <w:strike/>
           <w:color w:val="00B0F0"/>
         </w:rPr>
         <w:t xml:space="preserve"> </w:t>
@@ -1435,6 +1505,7 @@
       <w:proofErr w:type="spellStart"/>
       <w:r>
         <w:rPr>
+          <w:strike/>
           <w:color w:val="00B0F0"/>
         </w:rPr>
         <w:t>overview</w:t>
@@ -1442,6 +1513,7 @@
       <w:proofErr w:type="spellEnd"/>
       <w:r>
         <w:rPr>
+          <w:strike/>
           <w:color w:val="00B0F0"/>
         </w:rPr>
         <w:t xml:space="preserve"> </w:t>
@@ -1449,6 +1521,7 @@
       <w:proofErr w:type="spellStart"/>
       <w:r>
         <w:rPr>
+          <w:strike/>
           <w:color w:val="00B0F0"/>
         </w:rPr>
         <w:t>description</w:t>
@@ -1456,6 +1529,7 @@
       <w:proofErr w:type="spellEnd"/>
       <w:r>
         <w:rPr>
+          <w:strike/>
           <w:color w:val="00B0F0"/>
         </w:rPr>
         <w:t xml:space="preserve"> </w:t>
@@ -1463,6 +1537,7 @@
       <w:proofErr w:type="spellStart"/>
       <w:r>
         <w:rPr>
+          <w:strike/>
           <w:color w:val="00B0F0"/>
         </w:rPr>
         <w:t>with</w:t>
@@ -1470,6 +1545,7 @@
       <w:proofErr w:type="spellEnd"/>
       <w:r>
         <w:rPr>
+          <w:strike/>
           <w:color w:val="00B0F0"/>
         </w:rPr>
         <w:t xml:space="preserve"> </w:t>
@@ -1477,6 +1553,7 @@
       <w:proofErr w:type="spellStart"/>
       <w:r>
         <w:rPr>
+          <w:strike/>
           <w:color w:val="00B0F0"/>
         </w:rPr>
         <w:t>questions</w:t>
@@ -1946,7 +2023,21 @@
         <w:rPr>
           <w:color w:val="F2CEED" w:themeColor="accent5" w:themeTint="33"/>
         </w:rPr>
-        <w:t xml:space="preserve"> Emotions </w:t>
+        <w:t xml:space="preserve"> </w:t>
+      </w:r>
+      <w:proofErr w:type="spellStart"/>
+      <w:r>
+        <w:rPr>
+          <w:color w:val="F2CEED" w:themeColor="accent5" w:themeTint="33"/>
+        </w:rPr>
+        <w:t>Emotions</w:t>
+      </w:r>
+      <w:proofErr w:type="spellEnd"/>
+      <w:r>
+        <w:rPr>
+          <w:color w:val="F2CEED" w:themeColor="accent5" w:themeTint="33"/>
+        </w:rPr>
+        <w:t xml:space="preserve"> </w:t>
       </w:r>
       <w:proofErr w:type="spellStart"/>
       <w:r>

</xml_diff>